<commit_message>
docs(bkm): ODAK SP düzeltme önerileri (17 blok, derlendi) + TODO B-183..B-197
- sorgular/2026-10-03-odak-duzeltme-onerileri.sql: her sorun için düzeltilmiş kod.
  Çalıştırılmadı (erp-write-policy); sys.dm_exec_describe_first_result_set ile
  17/17 derlendi (kırılabilirlik: bozuk kolon → 207), etkisi SELECT karşılığıyla ölçüldü
  (S-1 aday 13.671 → 553 · S-5 2.360/115/62 · S-4 599.096 · S-12 12.778 ...)
- Word brief §7: her sorunun altına önerilen kod + etki
- TODO: ODAK ürün hattı grubu, öncelik sırasıyla 15 madde

Co-Authored-By: Claude Opus 5.5 <noreply@anthropic.com>
</commit_message>
<xml_diff>
--- a/docs/13-odak-entegrasyon-brief.docx
+++ b/docs/13-odak-entegrasyon-brief.docx
@@ -12890,7 +12890,24 @@
           <w:sz w:val="20"/>
           <w:szCs w:val="20"/>
         </w:rPr>
-        <w:t xml:space="preserve"> tanımına göredir (SSMS'te Modify ile açınca aynı satır).</w:t>
+        <w:t xml:space="preserve"> tanımına göredir (SSMS'te Modify ile açınca aynı satır). Her sorunun altındaki önerilen kod derleme kontrolünden geçti (çalıştırılmadı) ve etkisi SELECT karşılığıyla ölçüldü; tüm bloklar </w:t>
+      </w:r>
+      <w:r>
+        <w:rPr>
+          <w:rFonts w:ascii="Consolas" w:cs="Consolas" w:eastAsia="Consolas" w:hAnsi="Consolas"/>
+          <w:color w:val="333333"/>
+          <w:sz w:val="18"/>
+          <w:szCs w:val="18"/>
+        </w:rPr>
+        <w:t xml:space="preserve">sorgular/2026-10-03-odak-duzeltme-onerileri.sql</w:t>
+      </w:r>
+      <w:r>
+        <w:rPr>
+          <w:rFonts w:ascii="Calibri" w:cs="Calibri" w:eastAsia="Calibri" w:hAnsi="Calibri"/>
+          <w:sz w:val="20"/>
+          <w:szCs w:val="20"/>
+        </w:rPr>
+        <w:t xml:space="preserve"> dosyasında.</w:t>
       </w:r>
     </w:p>
     <w:p>
@@ -13381,7 +13398,7 @@
           <w:sz w:val="17"/>
           <w:szCs w:val="17"/>
         </w:rPr>
-        <w:t xml:space="preserve">Kod:</w:t>
+        <w:t xml:space="preserve">Mevcut kod:</w:t>
       </w:r>
     </w:p>
     <w:p>
@@ -13466,6 +13483,644 @@
           <w:szCs w:val="16"/>
         </w:rPr>
         <w:t xml:space="preserve">131| WHERE ub228.bVeriID IS NULL</w:t>
+      </w:r>
+    </w:p>
+    <w:p>
+      <w:pPr>
+        <w:spacing w:after="40" w:before="100"/>
+      </w:pPr>
+      <w:r>
+        <w:rPr>
+          <w:rFonts w:ascii="Calibri" w:cs="Calibri" w:eastAsia="Calibri" w:hAnsi="Calibri"/>
+          <w:b/>
+          <w:bCs/>
+          <w:color w:val="1E7B34"/>
+          <w:sz w:val="17"/>
+          <w:szCs w:val="17"/>
+        </w:rPr>
+        <w:t xml:space="preserve">Önerilen düzeltme (S-1):</w:t>
+      </w:r>
+    </w:p>
+    <w:p>
+      <w:pPr>
+        <w:spacing w:after="40"/>
+      </w:pPr>
+      <w:r>
+        <w:rPr>
+          <w:rFonts w:ascii="Calibri" w:cs="Calibri" w:eastAsia="Calibri" w:hAnsi="Calibri"/>
+          <w:i/>
+          <w:iCs/>
+          <w:color w:val="555555"/>
+          <w:sz w:val="17"/>
+          <w:szCs w:val="17"/>
+        </w:rPr>
+        <w:t xml:space="preserve">Etki(ölçüldü): ikinci blok adayı 13.671 ürün → 553 ürün. 228'li 10.108 ürünlük saatlik döngü ve 220'li 15 ürün düşer.</w:t>
+      </w:r>
+    </w:p>
+    <w:p>
+      <w:pPr>
+        <w:shd w:fill="F4F4F4" w:color="auto" w:val="clear"/>
+        <w:spacing w:after="0"/>
+      </w:pPr>
+      <w:r>
+        <w:rPr>
+          <w:rFonts w:ascii="Consolas" w:cs="Consolas" w:eastAsia="Consolas" w:hAnsi="Consolas"/>
+          <w:sz w:val="16"/>
+          <w:szCs w:val="16"/>
+        </w:rPr>
+        <w:t xml:space="preserve">;WITH aaa AS (</w:t>
+      </w:r>
+    </w:p>
+    <w:p>
+      <w:pPr>
+        <w:shd w:fill="F4F4F4" w:color="auto" w:val="clear"/>
+        <w:spacing w:after="0"/>
+      </w:pPr>
+      <w:r>
+        <w:rPr>
+          <w:rFonts w:ascii="Consolas" w:cs="Consolas" w:eastAsia="Consolas" w:hAnsi="Consolas"/>
+          <w:sz w:val="16"/>
+          <w:szCs w:val="16"/>
+        </w:rPr>
+        <w:t xml:space="preserve">    SELECT u.stkID fStkID,</w:t>
+      </w:r>
+    </w:p>
+    <w:p>
+      <w:pPr>
+        <w:shd w:fill="F4F4F4" w:color="auto" w:val="clear"/>
+        <w:spacing w:after="0"/>
+      </w:pPr>
+      <w:r>
+        <w:rPr>
+          <w:rFonts w:ascii="Consolas" w:cs="Consolas" w:eastAsia="Consolas" w:hAnsi="Consolas"/>
+          <w:sz w:val="16"/>
+          <w:szCs w:val="16"/>
+        </w:rPr>
+        <w:t xml:space="preserve">           CASE WHEN sonrakiFiyat IS NULL THEN u.fiyatS ELSE sonrakiFiyat END sonrakiFiyat,</w:t>
+      </w:r>
+    </w:p>
+    <w:p>
+      <w:pPr>
+        <w:shd w:fill="F4F4F4" w:color="auto" w:val="clear"/>
+        <w:spacing w:after="0"/>
+      </w:pPr>
+      <w:r>
+        <w:rPr>
+          <w:rFonts w:ascii="Consolas" w:cs="Consolas" w:eastAsia="Consolas" w:hAnsi="Consolas"/>
+          <w:sz w:val="16"/>
+          <w:szCs w:val="16"/>
+        </w:rPr>
+        <w:t xml:space="preserve">           ISNULL(fInd1,0) fInd1, u.fiyatS, u.urnMrkID,</w:t>
+      </w:r>
+    </w:p>
+    <w:p>
+      <w:pPr>
+        <w:shd w:fill="F4F4F4" w:color="auto" w:val="clear"/>
+        <w:spacing w:after="0"/>
+      </w:pPr>
+      <w:r>
+        <w:rPr>
+          <w:rFonts w:ascii="Consolas" w:cs="Consolas" w:eastAsia="Consolas" w:hAnsi="Consolas"/>
+          <w:sz w:val="16"/>
+          <w:szCs w:val="16"/>
+        </w:rPr>
+        <w:t xml:space="preserve">           ROW_NUMBER() OVER (PARTITION BY u.stkID ORDER BY fTarihSon DESC) sno</w:t>
+      </w:r>
+    </w:p>
+    <w:p>
+      <w:pPr>
+        <w:shd w:fill="F4F4F4" w:color="auto" w:val="clear"/>
+        <w:spacing w:after="0"/>
+      </w:pPr>
+      <w:r>
+        <w:rPr>
+          <w:rFonts w:ascii="Consolas" w:cs="Consolas" w:eastAsia="Consolas" w:hAnsi="Consolas"/>
+          <w:sz w:val="16"/>
+          <w:szCs w:val="16"/>
+        </w:rPr>
+        <w:t xml:space="preserve">    FROM urn u WITH (NOLOCK)</w:t>
+      </w:r>
+    </w:p>
+    <w:p>
+      <w:pPr>
+        <w:shd w:fill="F4F4F4" w:color="auto" w:val="clear"/>
+        <w:spacing w:after="0"/>
+      </w:pPr>
+      <w:r>
+        <w:rPr>
+          <w:rFonts w:ascii="Consolas" w:cs="Consolas" w:eastAsia="Consolas" w:hAnsi="Consolas"/>
+          <w:sz w:val="16"/>
+          <w:szCs w:val="16"/>
+        </w:rPr>
+        <w:t xml:space="preserve">    LEFT JOIN fytOzl a WITH (NOLOCK) ON a.fStkID = u.stkID AND a.fFrmID IN (9525) AND fTur = 1 AND fTip = 1</w:t>
+      </w:r>
+    </w:p>
+    <w:p>
+      <w:pPr>
+        <w:shd w:fill="F4F4F4" w:color="auto" w:val="clear"/>
+        <w:spacing w:after="0"/>
+      </w:pPr>
+      <w:r>
+        <w:rPr>
+          <w:rFonts w:ascii="Consolas" w:cs="Consolas" w:eastAsia="Consolas" w:hAnsi="Consolas"/>
+          <w:sz w:val="16"/>
+          <w:szCs w:val="16"/>
+        </w:rPr>
+        <w:t xml:space="preserve">)</w:t>
+      </w:r>
+    </w:p>
+    <w:p>
+      <w:pPr>
+        <w:shd w:fill="F4F4F4" w:color="auto" w:val="clear"/>
+        <w:spacing w:after="0"/>
+      </w:pPr>
+      <w:r>
+        <w:rPr>
+          <w:rFonts w:ascii="Consolas" w:cs="Consolas" w:eastAsia="Consolas" w:hAnsi="Consolas"/>
+          <w:sz w:val="16"/>
+          <w:szCs w:val="16"/>
+        </w:rPr>
+        <w:t xml:space="preserve">INSERT INTO #odakFiyatTemp</w:t>
+      </w:r>
+    </w:p>
+    <w:p>
+      <w:pPr>
+        <w:shd w:fill="F4F4F4" w:color="auto" w:val="clear"/>
+        <w:spacing w:after="0"/>
+      </w:pPr>
+      <w:r>
+        <w:rPr>
+          <w:rFonts w:ascii="Consolas" w:cs="Consolas" w:eastAsia="Consolas" w:hAnsi="Consolas"/>
+          <w:sz w:val="16"/>
+          <w:szCs w:val="16"/>
+        </w:rPr>
+        <w:t xml:space="preserve">SELECT a.fStkID, 9525, a.urnMrkID,</w:t>
+      </w:r>
+    </w:p>
+    <w:p>
+      <w:pPr>
+        <w:shd w:fill="F4F4F4" w:color="auto" w:val="clear"/>
+        <w:spacing w:after="0"/>
+      </w:pPr>
+      <w:r>
+        <w:rPr>
+          <w:rFonts w:ascii="Consolas" w:cs="Consolas" w:eastAsia="Consolas" w:hAnsi="Consolas"/>
+          <w:sz w:val="16"/>
+          <w:szCs w:val="16"/>
+        </w:rPr>
+        <w:t xml:space="preserve">       u.fiyatS,                                                    -- DÜZELTME: gerçek önceki fiyat (eski: etiket − 0,01)</w:t>
+      </w:r>
+    </w:p>
+    <w:p>
+      <w:pPr>
+        <w:shd w:fill="F4F4F4" w:color="auto" w:val="clear"/>
+        <w:spacing w:after="0"/>
+      </w:pPr>
+      <w:r>
+        <w:rPr>
+          <w:rFonts w:ascii="Consolas" w:cs="Consolas" w:eastAsia="Consolas" w:hAnsi="Consolas"/>
+          <w:sz w:val="16"/>
+          <w:szCs w:val="16"/>
+        </w:rPr>
+        <w:t xml:space="preserve">       CASE WHEN ISNULL(cift.Fiyat,-1) &lt; odak.etiket_fiyat THEN odak.etiket_fiyat ELSE ISNULL(cift.Fiyat,-1) END,</w:t>
+      </w:r>
+    </w:p>
+    <w:p>
+      <w:pPr>
+        <w:shd w:fill="F4F4F4" w:color="auto" w:val="clear"/>
+        <w:spacing w:after="0"/>
+      </w:pPr>
+      <w:r>
+        <w:rPr>
+          <w:rFonts w:ascii="Consolas" w:cs="Consolas" w:eastAsia="Consolas" w:hAnsi="Consolas"/>
+          <w:sz w:val="16"/>
+          <w:szCs w:val="16"/>
+        </w:rPr>
+        <w:t xml:space="preserve">       mar.discount, cift.Fiyat, ub.urnBarkod</w:t>
+      </w:r>
+    </w:p>
+    <w:p>
+      <w:pPr>
+        <w:shd w:fill="F4F4F4" w:color="auto" w:val="clear"/>
+        <w:spacing w:after="0"/>
+      </w:pPr>
+      <w:r>
+        <w:rPr>
+          <w:rFonts w:ascii="Consolas" w:cs="Consolas" w:eastAsia="Consolas" w:hAnsi="Consolas"/>
+          <w:sz w:val="16"/>
+          <w:szCs w:val="16"/>
+        </w:rPr>
+        <w:t xml:space="preserve">FROM aaa a</w:t>
+      </w:r>
+    </w:p>
+    <w:p>
+      <w:pPr>
+        <w:shd w:fill="F4F4F4" w:color="auto" w:val="clear"/>
+        <w:spacing w:after="0"/>
+      </w:pPr>
+      <w:r>
+        <w:rPr>
+          <w:rFonts w:ascii="Consolas" w:cs="Consolas" w:eastAsia="Consolas" w:hAnsi="Consolas"/>
+          <w:sz w:val="16"/>
+          <w:szCs w:val="16"/>
+        </w:rPr>
+        <w:t xml:space="preserve">JOIN urn u                                  WITH (NOLOCK) ON u.stkID = a.fStkID</w:t>
+      </w:r>
+    </w:p>
+    <w:p>
+      <w:pPr>
+        <w:shd w:fill="F4F4F4" w:color="auto" w:val="clear"/>
+        <w:spacing w:after="0"/>
+      </w:pPr>
+      <w:r>
+        <w:rPr>
+          <w:rFonts w:ascii="Consolas" w:cs="Consolas" w:eastAsia="Consolas" w:hAnsi="Consolas"/>
+          <w:sz w:val="16"/>
+          <w:szCs w:val="16"/>
+        </w:rPr>
+        <w:t xml:space="preserve">JOIN urnBrkd AS ub                          WITH (NOLOCK) ON ub.urnBrkdStkID = u.stkID</w:t>
+      </w:r>
+    </w:p>
+    <w:p>
+      <w:pPr>
+        <w:shd w:fill="F4F4F4" w:color="auto" w:val="clear"/>
+        <w:spacing w:after="0"/>
+      </w:pPr>
+      <w:r>
+        <w:rPr>
+          <w:rFonts w:ascii="Consolas" w:cs="Consolas" w:eastAsia="Consolas" w:hAnsi="Consolas"/>
+          <w:sz w:val="16"/>
+          <w:szCs w:val="16"/>
+        </w:rPr>
+        <w:t xml:space="preserve">JOIN BKMDATA.ent.odak_urun_tam AS odak      WITH (NOLOCK) ON odak.barkod = ub.urnBarkod</w:t>
+      </w:r>
+    </w:p>
+    <w:p>
+      <w:pPr>
+        <w:shd w:fill="F4F4F4" w:color="auto" w:val="clear"/>
+        <w:spacing w:after="0"/>
+      </w:pPr>
+      <w:r>
+        <w:rPr>
+          <w:rFonts w:ascii="Consolas" w:cs="Consolas" w:eastAsia="Consolas" w:hAnsi="Consolas"/>
+          <w:sz w:val="16"/>
+          <w:szCs w:val="16"/>
+        </w:rPr>
+        <w:t xml:space="preserve">JOIN BKMDATA.ent.odak_marka AS mar          WITH (NOLOCK) ON mar.group_id = odak.group_id AND mar.parent_id = odak.marka_id</w:t>
+      </w:r>
+    </w:p>
+    <w:p>
+      <w:pPr>
+        <w:shd w:fill="F4F4F4" w:color="auto" w:val="clear"/>
+        <w:spacing w:after="0"/>
+      </w:pPr>
+      <w:r>
+        <w:rPr>
+          <w:rFonts w:ascii="Consolas" w:cs="Consolas" w:eastAsia="Consolas" w:hAnsi="Consolas"/>
+          <w:sz w:val="16"/>
+          <w:szCs w:val="16"/>
+        </w:rPr>
+        <w:t xml:space="preserve">LEFT JOIN bkm.CiftUrunlerMaxFyat cift       WITH (NOLOCK) ON cift.urnBrkdStkID = ub.urnBrkdStkID</w:t>
+      </w:r>
+    </w:p>
+    <w:p>
+      <w:pPr>
+        <w:shd w:fill="F4F4F4" w:color="auto" w:val="clear"/>
+        <w:spacing w:after="0"/>
+      </w:pPr>
+      <w:r>
+        <w:rPr>
+          <w:rFonts w:ascii="Consolas" w:cs="Consolas" w:eastAsia="Consolas" w:hAnsi="Consolas"/>
+          <w:sz w:val="16"/>
+          <w:szCs w:val="16"/>
+        </w:rPr>
+        <w:t xml:space="preserve">LEFT JOIN #odakFiyatTemp temp                              ON temp.stkID = a.fStkID</w:t>
+      </w:r>
+    </w:p>
+    <w:p>
+      <w:pPr>
+        <w:shd w:fill="F4F4F4" w:color="auto" w:val="clear"/>
+        <w:spacing w:after="0"/>
+      </w:pPr>
+      <w:r>
+        <w:rPr>
+          <w:rFonts w:ascii="Consolas" w:cs="Consolas" w:eastAsia="Consolas" w:hAnsi="Consolas"/>
+          <w:sz w:val="16"/>
+          <w:szCs w:val="16"/>
+        </w:rPr>
+        <w:t xml:space="preserve">LEFT JOIN urnBilgi ub220                    WITH (NOLOCK) ON ub220.bVeriID = u.stkID AND ub220.bBilgiID = 220 AND ub220.bDeger = 'True'   -- DÜZELTME S-2</w:t>
+      </w:r>
+    </w:p>
+    <w:p>
+      <w:pPr>
+        <w:shd w:fill="F4F4F4" w:color="auto" w:val="clear"/>
+        <w:spacing w:after="0"/>
+      </w:pPr>
+      <w:r>
+        <w:rPr>
+          <w:rFonts w:ascii="Consolas" w:cs="Consolas" w:eastAsia="Consolas" w:hAnsi="Consolas"/>
+          <w:sz w:val="16"/>
+          <w:szCs w:val="16"/>
+        </w:rPr>
+        <w:t xml:space="preserve">LEFT JOIN urnBilgi ub228                    WITH (NOLOCK) ON ub228.bVeriID = u.stkID AND ub228.bBilgiID = 228 AND ub228.bDeger = 'True'   -- DÜZELTME S-1</w:t>
+      </w:r>
+    </w:p>
+    <w:p>
+      <w:pPr>
+        <w:shd w:fill="F4F4F4" w:color="auto" w:val="clear"/>
+        <w:spacing w:after="0"/>
+      </w:pPr>
+      <w:r>
+        <w:rPr>
+          <w:rFonts w:ascii="Consolas" w:cs="Consolas" w:eastAsia="Consolas" w:hAnsi="Consolas"/>
+          <w:sz w:val="16"/>
+          <w:szCs w:val="16"/>
+        </w:rPr>
+        <w:t xml:space="preserve">WHERE sno = 1</w:t>
+      </w:r>
+    </w:p>
+    <w:p>
+      <w:pPr>
+        <w:shd w:fill="F4F4F4" w:color="auto" w:val="clear"/>
+        <w:spacing w:after="0"/>
+      </w:pPr>
+      <w:r>
+        <w:rPr>
+          <w:rFonts w:ascii="Consolas" w:cs="Consolas" w:eastAsia="Consolas" w:hAnsi="Consolas"/>
+          <w:sz w:val="16"/>
+          <w:szCs w:val="16"/>
+        </w:rPr>
+        <w:t xml:space="preserve">  AND fInd1 &lt;&gt; ISNULL(mar.discount,0)</w:t>
+      </w:r>
+    </w:p>
+    <w:p>
+      <w:pPr>
+        <w:shd w:fill="F4F4F4" w:color="auto" w:val="clear"/>
+        <w:spacing w:after="0"/>
+      </w:pPr>
+      <w:r>
+        <w:rPr>
+          <w:rFonts w:ascii="Consolas" w:cs="Consolas" w:eastAsia="Consolas" w:hAnsi="Consolas"/>
+          <w:sz w:val="16"/>
+          <w:szCs w:val="16"/>
+        </w:rPr>
+        <w:t xml:space="preserve">  AND temp.stkID IS NULL</w:t>
+      </w:r>
+    </w:p>
+    <w:p>
+      <w:pPr>
+        <w:shd w:fill="F4F4F4" w:color="auto" w:val="clear"/>
+        <w:spacing w:after="0"/>
+      </w:pPr>
+      <w:r>
+        <w:rPr>
+          <w:rFonts w:ascii="Consolas" w:cs="Consolas" w:eastAsia="Consolas" w:hAnsi="Consolas"/>
+          <w:sz w:val="16"/>
+          <w:szCs w:val="16"/>
+        </w:rPr>
+        <w:t xml:space="preserve">  AND ub220.bVeriID IS NULL          -- DÜZELTME S-2: "Odak Fiyat Güncellenmesin" bu blokta da geçerli</w:t>
+      </w:r>
+    </w:p>
+    <w:p>
+      <w:pPr>
+        <w:shd w:fill="F4F4F4" w:color="auto" w:val="clear"/>
+        <w:spacing w:after="0"/>
+      </w:pPr>
+      <w:r>
+        <w:rPr>
+          <w:rFonts w:ascii="Consolas" w:cs="Consolas" w:eastAsia="Consolas" w:hAnsi="Consolas"/>
+          <w:sz w:val="16"/>
+          <w:szCs w:val="16"/>
+        </w:rPr>
+        <w:t xml:space="preserve">  AND ub228.bVeriID IS NULL          -- DÜZELTME S-1: alış satırı yazılmayan üründe iskonto kıyası hiç kapanmaz</w:t>
+      </w:r>
+    </w:p>
+    <w:p>
+      <w:pPr>
+        <w:shd w:fill="F4F4F4" w:color="auto" w:val="clear"/>
+        <w:spacing w:after="0"/>
+      </w:pPr>
+      <w:r>
+        <w:rPr>
+          <w:rFonts w:ascii="Consolas" w:cs="Consolas" w:eastAsia="Consolas" w:hAnsi="Consolas"/>
+          <w:sz w:val="16"/>
+          <w:szCs w:val="16"/>
+        </w:rPr>
+        <w:t xml:space="preserve">  AND odak.SilinecekUrun = 0         -- birinci bloktaki (satır 56–57) korumalar</w:t>
+      </w:r>
+    </w:p>
+    <w:p>
+      <w:pPr>
+        <w:shd w:fill="F4F4F4" w:color="auto" w:val="clear"/>
+        <w:spacing w:after="0"/>
+      </w:pPr>
+      <w:r>
+        <w:rPr>
+          <w:rFonts w:ascii="Consolas" w:cs="Consolas" w:eastAsia="Consolas" w:hAnsi="Consolas"/>
+          <w:sz w:val="16"/>
+          <w:szCs w:val="16"/>
+        </w:rPr>
+        <w:t xml:space="preserve">  AND odak.etiket_fiyat &lt; 999999;</w:t>
+      </w:r>
+    </w:p>
+    <w:p>
+      <w:pPr>
+        <w:spacing w:after="40" w:before="100"/>
+      </w:pPr>
+      <w:r>
+        <w:rPr>
+          <w:rFonts w:ascii="Calibri" w:cs="Calibri" w:eastAsia="Calibri" w:hAnsi="Calibri"/>
+          <w:b/>
+          <w:bCs/>
+          <w:color w:val="1E7B34"/>
+          <w:sz w:val="17"/>
+          <w:szCs w:val="17"/>
+        </w:rPr>
+        <w:t xml:space="preserve">Önerilen düzeltme (S-3):</w:t>
+      </w:r>
+    </w:p>
+    <w:p>
+      <w:pPr>
+        <w:spacing w:after="40"/>
+      </w:pPr>
+      <w:r>
+        <w:rPr>
+          <w:rFonts w:ascii="Calibri" w:cs="Calibri" w:eastAsia="Calibri" w:hAnsi="Calibri"/>
+          <w:i/>
+          <w:iCs/>
+          <w:color w:val="555555"/>
+          <w:sz w:val="17"/>
+          <w:szCs w:val="17"/>
+        </w:rPr>
+        <w:t xml:space="preserve">Etki: temp tabloya bağlı, SELECT karşılığı kurulamadı. Hedef: aynı ürün-gün 323.590 tekrar satış satırı → 0; değişmeyen fiyat için satış satırı yazılmaz.</w:t>
+      </w:r>
+    </w:p>
+    <w:p>
+      <w:pPr>
+        <w:shd w:fill="F4F4F4" w:color="auto" w:val="clear"/>
+        <w:spacing w:after="0"/>
+      </w:pPr>
+      <w:r>
+        <w:rPr>
+          <w:rFonts w:ascii="Consolas" w:cs="Consolas" w:eastAsia="Consolas" w:hAnsi="Consolas"/>
+          <w:sz w:val="16"/>
+          <w:szCs w:val="16"/>
+        </w:rPr>
+        <w:t xml:space="preserve">SELECT i.feID, t.stkID, dbo.fn_tarih(null), 0, t.fiyatS, t.etiket_fiyat, 0, 0, 0, t.etiket_fiyat,</w:t>
+      </w:r>
+    </w:p>
+    <w:p>
+      <w:pPr>
+        <w:shd w:fill="F4F4F4" w:color="auto" w:val="clear"/>
+        <w:spacing w:after="0"/>
+      </w:pPr>
+      <w:r>
+        <w:rPr>
+          <w:rFonts w:ascii="Consolas" w:cs="Consolas" w:eastAsia="Consolas" w:hAnsi="Consolas"/>
+          <w:sz w:val="16"/>
+          <w:szCs w:val="16"/>
+        </w:rPr>
+        <w:t xml:space="preserve">       @kisi, ROW_NUMBER() OVER (PARTITION BY i.feID ORDER BY t.stkID), dbo.fn_tarih(null), t.firmaID, 1</w:t>
+      </w:r>
+    </w:p>
+    <w:p>
+      <w:pPr>
+        <w:shd w:fill="F4F4F4" w:color="auto" w:val="clear"/>
+        <w:spacing w:after="0"/>
+      </w:pPr>
+      <w:r>
+        <w:rPr>
+          <w:rFonts w:ascii="Consolas" w:cs="Consolas" w:eastAsia="Consolas" w:hAnsi="Consolas"/>
+          <w:sz w:val="16"/>
+          <w:szCs w:val="16"/>
+        </w:rPr>
+        <w:t xml:space="preserve">FROM (SELECT x.*, ROW_NUMBER() OVER (PARTITION BY x.stkID</w:t>
+      </w:r>
+    </w:p>
+    <w:p>
+      <w:pPr>
+        <w:shd w:fill="F4F4F4" w:color="auto" w:val="clear"/>
+        <w:spacing w:after="0"/>
+      </w:pPr>
+      <w:r>
+        <w:rPr>
+          <w:rFonts w:ascii="Consolas" w:cs="Consolas" w:eastAsia="Consolas" w:hAnsi="Consolas"/>
+          <w:sz w:val="16"/>
+          <w:szCs w:val="16"/>
+        </w:rPr>
+        <w:t xml:space="preserve">                                     ORDER BY CASE WHEN x.firmaID = 9525 THEN 0 ELSE 1 END, x.firmaID) rn</w:t>
+      </w:r>
+    </w:p>
+    <w:p>
+      <w:pPr>
+        <w:shd w:fill="F4F4F4" w:color="auto" w:val="clear"/>
+        <w:spacing w:after="0"/>
+      </w:pPr>
+      <w:r>
+        <w:rPr>
+          <w:rFonts w:ascii="Consolas" w:cs="Consolas" w:eastAsia="Consolas" w:hAnsi="Consolas"/>
+          <w:sz w:val="16"/>
+          <w:szCs w:val="16"/>
+        </w:rPr>
+        <w:t xml:space="preserve">      FROM #odakFiyatTemp x) t                                       -- DÜZELTME S-3: ürün başına tek satış satırı</w:t>
+      </w:r>
+    </w:p>
+    <w:p>
+      <w:pPr>
+        <w:shd w:fill="F4F4F4" w:color="auto" w:val="clear"/>
+        <w:spacing w:after="0"/>
+      </w:pPr>
+      <w:r>
+        <w:rPr>
+          <w:rFonts w:ascii="Consolas" w:cs="Consolas" w:eastAsia="Consolas" w:hAnsi="Consolas"/>
+          <w:sz w:val="16"/>
+          <w:szCs w:val="16"/>
+        </w:rPr>
+        <w:t xml:space="preserve">INNER JOIN frm    WITH (NOLOCK) ON frmID = t.firmaID</w:t>
+      </w:r>
+    </w:p>
+    <w:p>
+      <w:pPr>
+        <w:shd w:fill="F4F4F4" w:color="auto" w:val="clear"/>
+        <w:spacing w:after="0"/>
+      </w:pPr>
+      <w:r>
+        <w:rPr>
+          <w:rFonts w:ascii="Consolas" w:cs="Consolas" w:eastAsia="Consolas" w:hAnsi="Consolas"/>
+          <w:sz w:val="16"/>
+          <w:szCs w:val="16"/>
+        </w:rPr>
+        <w:t xml:space="preserve">INNER JOIN urnFrm WITH (NOLOCK) ON urnFrmStkID = t.stkID AND urnFrmFirmaID = t.firmaID</w:t>
+      </w:r>
+    </w:p>
+    <w:p>
+      <w:pPr>
+        <w:shd w:fill="F4F4F4" w:color="auto" w:val="clear"/>
+        <w:spacing w:after="0"/>
+      </w:pPr>
+      <w:r>
+        <w:rPr>
+          <w:rFonts w:ascii="Consolas" w:cs="Consolas" w:eastAsia="Consolas" w:hAnsi="Consolas"/>
+          <w:sz w:val="16"/>
+          <w:szCs w:val="16"/>
+        </w:rPr>
+        <w:t xml:space="preserve">INNER JOIN fytB   WITH (NOLOCK) ON SUBSTRING(frmAd,1,10)+' Odak2 Ent' = feNot AND t.firmaID = feFrmID AND feOnay = 1</w:t>
+      </w:r>
+    </w:p>
+    <w:p>
+      <w:pPr>
+        <w:shd w:fill="F4F4F4" w:color="auto" w:val="clear"/>
+        <w:spacing w:after="0"/>
+      </w:pPr>
+      <w:r>
+        <w:rPr>
+          <w:rFonts w:ascii="Consolas" w:cs="Consolas" w:eastAsia="Consolas" w:hAnsi="Consolas"/>
+          <w:sz w:val="16"/>
+          <w:szCs w:val="16"/>
+        </w:rPr>
+        <w:t xml:space="preserve">        AND feTarihA = dbo.fn_tarih(null) AND feTarihAson = feTarihA AND feTarihS = feTarihA AND feTarihSson = feTarihA</w:t>
+      </w:r>
+    </w:p>
+    <w:p>
+      <w:pPr>
+        <w:shd w:fill="F4F4F4" w:color="auto" w:val="clear"/>
+        <w:spacing w:after="0"/>
+      </w:pPr>
+      <w:r>
+        <w:rPr>
+          <w:rFonts w:ascii="Consolas" w:cs="Consolas" w:eastAsia="Consolas" w:hAnsi="Consolas"/>
+          <w:sz w:val="16"/>
+          <w:szCs w:val="16"/>
+        </w:rPr>
+        <w:t xml:space="preserve">JOIN #inserted AS i ON i.feID = fytB.feID AND i.feNot = fytB.feNot AND i.feFrmID = fytB.feFrmID</w:t>
+      </w:r>
+    </w:p>
+    <w:p>
+      <w:pPr>
+        <w:shd w:fill="F4F4F4" w:color="auto" w:val="clear"/>
+        <w:spacing w:after="0"/>
+      </w:pPr>
+      <w:r>
+        <w:rPr>
+          <w:rFonts w:ascii="Consolas" w:cs="Consolas" w:eastAsia="Consolas" w:hAnsi="Consolas"/>
+          <w:sz w:val="16"/>
+          <w:szCs w:val="16"/>
+        </w:rPr>
+        <w:t xml:space="preserve">WHERE t.rn = 1</w:t>
+      </w:r>
+    </w:p>
+    <w:p>
+      <w:pPr>
+        <w:shd w:fill="F4F4F4" w:color="auto" w:val="clear"/>
+        <w:spacing w:after="0"/>
+      </w:pPr>
+      <w:r>
+        <w:rPr>
+          <w:rFonts w:ascii="Consolas" w:cs="Consolas" w:eastAsia="Consolas" w:hAnsi="Consolas"/>
+          <w:sz w:val="16"/>
+          <w:szCs w:val="16"/>
+        </w:rPr>
+        <w:t xml:space="preserve">  AND t.fiyatS &lt;&gt; t.etiket_fiyat;                                   -- DÜZELTME S-1: fiyat değişmiyorsa satış satırı yok</w:t>
       </w:r>
     </w:p>
     <w:p>
@@ -13852,7 +14507,7 @@
           <w:sz w:val="17"/>
           <w:szCs w:val="17"/>
         </w:rPr>
-        <w:t xml:space="preserve">Kod:</w:t>
+        <w:t xml:space="preserve">Mevcut kod:</w:t>
       </w:r>
     </w:p>
     <w:p>
@@ -13895,6 +14550,444 @@
           <w:szCs w:val="16"/>
         </w:rPr>
         <w:t xml:space="preserve">84| WHERE sno=1 AND fInd1&lt;&gt;ISNULL(mar.discount,0) ...   &lt;- 220 süzgeci yok</w:t>
+      </w:r>
+    </w:p>
+    <w:p>
+      <w:pPr>
+        <w:spacing w:after="40" w:before="100"/>
+      </w:pPr>
+      <w:r>
+        <w:rPr>
+          <w:rFonts w:ascii="Calibri" w:cs="Calibri" w:eastAsia="Calibri" w:hAnsi="Calibri"/>
+          <w:b/>
+          <w:bCs/>
+          <w:color w:val="1E7B34"/>
+          <w:sz w:val="17"/>
+          <w:szCs w:val="17"/>
+        </w:rPr>
+        <w:t xml:space="preserve">Önerilen düzeltme:</w:t>
+      </w:r>
+    </w:p>
+    <w:p>
+      <w:pPr>
+        <w:spacing w:after="40"/>
+      </w:pPr>
+      <w:r>
+        <w:rPr>
+          <w:rFonts w:ascii="Calibri" w:cs="Calibri" w:eastAsia="Calibri" w:hAnsi="Calibri"/>
+          <w:i/>
+          <w:iCs/>
+          <w:color w:val="555555"/>
+          <w:sz w:val="17"/>
+          <w:szCs w:val="17"/>
+        </w:rPr>
+        <w:t xml:space="preserve">Etki(ölçüldü): ikinci blok adayı 13.671 ürün → 553 ürün. 228'li 10.108 ürünlük saatlik döngü ve 220'li 15 ürün düşer.</w:t>
+      </w:r>
+    </w:p>
+    <w:p>
+      <w:pPr>
+        <w:shd w:fill="F4F4F4" w:color="auto" w:val="clear"/>
+        <w:spacing w:after="0"/>
+      </w:pPr>
+      <w:r>
+        <w:rPr>
+          <w:rFonts w:ascii="Consolas" w:cs="Consolas" w:eastAsia="Consolas" w:hAnsi="Consolas"/>
+          <w:sz w:val="16"/>
+          <w:szCs w:val="16"/>
+        </w:rPr>
+        <w:t xml:space="preserve">;WITH aaa AS (</w:t>
+      </w:r>
+    </w:p>
+    <w:p>
+      <w:pPr>
+        <w:shd w:fill="F4F4F4" w:color="auto" w:val="clear"/>
+        <w:spacing w:after="0"/>
+      </w:pPr>
+      <w:r>
+        <w:rPr>
+          <w:rFonts w:ascii="Consolas" w:cs="Consolas" w:eastAsia="Consolas" w:hAnsi="Consolas"/>
+          <w:sz w:val="16"/>
+          <w:szCs w:val="16"/>
+        </w:rPr>
+        <w:t xml:space="preserve">    SELECT u.stkID fStkID,</w:t>
+      </w:r>
+    </w:p>
+    <w:p>
+      <w:pPr>
+        <w:shd w:fill="F4F4F4" w:color="auto" w:val="clear"/>
+        <w:spacing w:after="0"/>
+      </w:pPr>
+      <w:r>
+        <w:rPr>
+          <w:rFonts w:ascii="Consolas" w:cs="Consolas" w:eastAsia="Consolas" w:hAnsi="Consolas"/>
+          <w:sz w:val="16"/>
+          <w:szCs w:val="16"/>
+        </w:rPr>
+        <w:t xml:space="preserve">           CASE WHEN sonrakiFiyat IS NULL THEN u.fiyatS ELSE sonrakiFiyat END sonrakiFiyat,</w:t>
+      </w:r>
+    </w:p>
+    <w:p>
+      <w:pPr>
+        <w:shd w:fill="F4F4F4" w:color="auto" w:val="clear"/>
+        <w:spacing w:after="0"/>
+      </w:pPr>
+      <w:r>
+        <w:rPr>
+          <w:rFonts w:ascii="Consolas" w:cs="Consolas" w:eastAsia="Consolas" w:hAnsi="Consolas"/>
+          <w:sz w:val="16"/>
+          <w:szCs w:val="16"/>
+        </w:rPr>
+        <w:t xml:space="preserve">           ISNULL(fInd1,0) fInd1, u.fiyatS, u.urnMrkID,</w:t>
+      </w:r>
+    </w:p>
+    <w:p>
+      <w:pPr>
+        <w:shd w:fill="F4F4F4" w:color="auto" w:val="clear"/>
+        <w:spacing w:after="0"/>
+      </w:pPr>
+      <w:r>
+        <w:rPr>
+          <w:rFonts w:ascii="Consolas" w:cs="Consolas" w:eastAsia="Consolas" w:hAnsi="Consolas"/>
+          <w:sz w:val="16"/>
+          <w:szCs w:val="16"/>
+        </w:rPr>
+        <w:t xml:space="preserve">           ROW_NUMBER() OVER (PARTITION BY u.stkID ORDER BY fTarihSon DESC) sno</w:t>
+      </w:r>
+    </w:p>
+    <w:p>
+      <w:pPr>
+        <w:shd w:fill="F4F4F4" w:color="auto" w:val="clear"/>
+        <w:spacing w:after="0"/>
+      </w:pPr>
+      <w:r>
+        <w:rPr>
+          <w:rFonts w:ascii="Consolas" w:cs="Consolas" w:eastAsia="Consolas" w:hAnsi="Consolas"/>
+          <w:sz w:val="16"/>
+          <w:szCs w:val="16"/>
+        </w:rPr>
+        <w:t xml:space="preserve">    FROM urn u WITH (NOLOCK)</w:t>
+      </w:r>
+    </w:p>
+    <w:p>
+      <w:pPr>
+        <w:shd w:fill="F4F4F4" w:color="auto" w:val="clear"/>
+        <w:spacing w:after="0"/>
+      </w:pPr>
+      <w:r>
+        <w:rPr>
+          <w:rFonts w:ascii="Consolas" w:cs="Consolas" w:eastAsia="Consolas" w:hAnsi="Consolas"/>
+          <w:sz w:val="16"/>
+          <w:szCs w:val="16"/>
+        </w:rPr>
+        <w:t xml:space="preserve">    LEFT JOIN fytOzl a WITH (NOLOCK) ON a.fStkID = u.stkID AND a.fFrmID IN (9525) AND fTur = 1 AND fTip = 1</w:t>
+      </w:r>
+    </w:p>
+    <w:p>
+      <w:pPr>
+        <w:shd w:fill="F4F4F4" w:color="auto" w:val="clear"/>
+        <w:spacing w:after="0"/>
+      </w:pPr>
+      <w:r>
+        <w:rPr>
+          <w:rFonts w:ascii="Consolas" w:cs="Consolas" w:eastAsia="Consolas" w:hAnsi="Consolas"/>
+          <w:sz w:val="16"/>
+          <w:szCs w:val="16"/>
+        </w:rPr>
+        <w:t xml:space="preserve">)</w:t>
+      </w:r>
+    </w:p>
+    <w:p>
+      <w:pPr>
+        <w:shd w:fill="F4F4F4" w:color="auto" w:val="clear"/>
+        <w:spacing w:after="0"/>
+      </w:pPr>
+      <w:r>
+        <w:rPr>
+          <w:rFonts w:ascii="Consolas" w:cs="Consolas" w:eastAsia="Consolas" w:hAnsi="Consolas"/>
+          <w:sz w:val="16"/>
+          <w:szCs w:val="16"/>
+        </w:rPr>
+        <w:t xml:space="preserve">INSERT INTO #odakFiyatTemp</w:t>
+      </w:r>
+    </w:p>
+    <w:p>
+      <w:pPr>
+        <w:shd w:fill="F4F4F4" w:color="auto" w:val="clear"/>
+        <w:spacing w:after="0"/>
+      </w:pPr>
+      <w:r>
+        <w:rPr>
+          <w:rFonts w:ascii="Consolas" w:cs="Consolas" w:eastAsia="Consolas" w:hAnsi="Consolas"/>
+          <w:sz w:val="16"/>
+          <w:szCs w:val="16"/>
+        </w:rPr>
+        <w:t xml:space="preserve">SELECT a.fStkID, 9525, a.urnMrkID,</w:t>
+      </w:r>
+    </w:p>
+    <w:p>
+      <w:pPr>
+        <w:shd w:fill="F4F4F4" w:color="auto" w:val="clear"/>
+        <w:spacing w:after="0"/>
+      </w:pPr>
+      <w:r>
+        <w:rPr>
+          <w:rFonts w:ascii="Consolas" w:cs="Consolas" w:eastAsia="Consolas" w:hAnsi="Consolas"/>
+          <w:sz w:val="16"/>
+          <w:szCs w:val="16"/>
+        </w:rPr>
+        <w:t xml:space="preserve">       u.fiyatS,                                                    -- DÜZELTME: gerçek önceki fiyat (eski: etiket − 0,01)</w:t>
+      </w:r>
+    </w:p>
+    <w:p>
+      <w:pPr>
+        <w:shd w:fill="F4F4F4" w:color="auto" w:val="clear"/>
+        <w:spacing w:after="0"/>
+      </w:pPr>
+      <w:r>
+        <w:rPr>
+          <w:rFonts w:ascii="Consolas" w:cs="Consolas" w:eastAsia="Consolas" w:hAnsi="Consolas"/>
+          <w:sz w:val="16"/>
+          <w:szCs w:val="16"/>
+        </w:rPr>
+        <w:t xml:space="preserve">       CASE WHEN ISNULL(cift.Fiyat,-1) &lt; odak.etiket_fiyat THEN odak.etiket_fiyat ELSE ISNULL(cift.Fiyat,-1) END,</w:t>
+      </w:r>
+    </w:p>
+    <w:p>
+      <w:pPr>
+        <w:shd w:fill="F4F4F4" w:color="auto" w:val="clear"/>
+        <w:spacing w:after="0"/>
+      </w:pPr>
+      <w:r>
+        <w:rPr>
+          <w:rFonts w:ascii="Consolas" w:cs="Consolas" w:eastAsia="Consolas" w:hAnsi="Consolas"/>
+          <w:sz w:val="16"/>
+          <w:szCs w:val="16"/>
+        </w:rPr>
+        <w:t xml:space="preserve">       mar.discount, cift.Fiyat, ub.urnBarkod</w:t>
+      </w:r>
+    </w:p>
+    <w:p>
+      <w:pPr>
+        <w:shd w:fill="F4F4F4" w:color="auto" w:val="clear"/>
+        <w:spacing w:after="0"/>
+      </w:pPr>
+      <w:r>
+        <w:rPr>
+          <w:rFonts w:ascii="Consolas" w:cs="Consolas" w:eastAsia="Consolas" w:hAnsi="Consolas"/>
+          <w:sz w:val="16"/>
+          <w:szCs w:val="16"/>
+        </w:rPr>
+        <w:t xml:space="preserve">FROM aaa a</w:t>
+      </w:r>
+    </w:p>
+    <w:p>
+      <w:pPr>
+        <w:shd w:fill="F4F4F4" w:color="auto" w:val="clear"/>
+        <w:spacing w:after="0"/>
+      </w:pPr>
+      <w:r>
+        <w:rPr>
+          <w:rFonts w:ascii="Consolas" w:cs="Consolas" w:eastAsia="Consolas" w:hAnsi="Consolas"/>
+          <w:sz w:val="16"/>
+          <w:szCs w:val="16"/>
+        </w:rPr>
+        <w:t xml:space="preserve">JOIN urn u                                  WITH (NOLOCK) ON u.stkID = a.fStkID</w:t>
+      </w:r>
+    </w:p>
+    <w:p>
+      <w:pPr>
+        <w:shd w:fill="F4F4F4" w:color="auto" w:val="clear"/>
+        <w:spacing w:after="0"/>
+      </w:pPr>
+      <w:r>
+        <w:rPr>
+          <w:rFonts w:ascii="Consolas" w:cs="Consolas" w:eastAsia="Consolas" w:hAnsi="Consolas"/>
+          <w:sz w:val="16"/>
+          <w:szCs w:val="16"/>
+        </w:rPr>
+        <w:t xml:space="preserve">JOIN urnBrkd AS ub                          WITH (NOLOCK) ON ub.urnBrkdStkID = u.stkID</w:t>
+      </w:r>
+    </w:p>
+    <w:p>
+      <w:pPr>
+        <w:shd w:fill="F4F4F4" w:color="auto" w:val="clear"/>
+        <w:spacing w:after="0"/>
+      </w:pPr>
+      <w:r>
+        <w:rPr>
+          <w:rFonts w:ascii="Consolas" w:cs="Consolas" w:eastAsia="Consolas" w:hAnsi="Consolas"/>
+          <w:sz w:val="16"/>
+          <w:szCs w:val="16"/>
+        </w:rPr>
+        <w:t xml:space="preserve">JOIN BKMDATA.ent.odak_urun_tam AS odak      WITH (NOLOCK) ON odak.barkod = ub.urnBarkod</w:t>
+      </w:r>
+    </w:p>
+    <w:p>
+      <w:pPr>
+        <w:shd w:fill="F4F4F4" w:color="auto" w:val="clear"/>
+        <w:spacing w:after="0"/>
+      </w:pPr>
+      <w:r>
+        <w:rPr>
+          <w:rFonts w:ascii="Consolas" w:cs="Consolas" w:eastAsia="Consolas" w:hAnsi="Consolas"/>
+          <w:sz w:val="16"/>
+          <w:szCs w:val="16"/>
+        </w:rPr>
+        <w:t xml:space="preserve">JOIN BKMDATA.ent.odak_marka AS mar          WITH (NOLOCK) ON mar.group_id = odak.group_id AND mar.parent_id = odak.marka_id</w:t>
+      </w:r>
+    </w:p>
+    <w:p>
+      <w:pPr>
+        <w:shd w:fill="F4F4F4" w:color="auto" w:val="clear"/>
+        <w:spacing w:after="0"/>
+      </w:pPr>
+      <w:r>
+        <w:rPr>
+          <w:rFonts w:ascii="Consolas" w:cs="Consolas" w:eastAsia="Consolas" w:hAnsi="Consolas"/>
+          <w:sz w:val="16"/>
+          <w:szCs w:val="16"/>
+        </w:rPr>
+        <w:t xml:space="preserve">LEFT JOIN bkm.CiftUrunlerMaxFyat cift       WITH (NOLOCK) ON cift.urnBrkdStkID = ub.urnBrkdStkID</w:t>
+      </w:r>
+    </w:p>
+    <w:p>
+      <w:pPr>
+        <w:shd w:fill="F4F4F4" w:color="auto" w:val="clear"/>
+        <w:spacing w:after="0"/>
+      </w:pPr>
+      <w:r>
+        <w:rPr>
+          <w:rFonts w:ascii="Consolas" w:cs="Consolas" w:eastAsia="Consolas" w:hAnsi="Consolas"/>
+          <w:sz w:val="16"/>
+          <w:szCs w:val="16"/>
+        </w:rPr>
+        <w:t xml:space="preserve">LEFT JOIN #odakFiyatTemp temp                              ON temp.stkID = a.fStkID</w:t>
+      </w:r>
+    </w:p>
+    <w:p>
+      <w:pPr>
+        <w:shd w:fill="F4F4F4" w:color="auto" w:val="clear"/>
+        <w:spacing w:after="0"/>
+      </w:pPr>
+      <w:r>
+        <w:rPr>
+          <w:rFonts w:ascii="Consolas" w:cs="Consolas" w:eastAsia="Consolas" w:hAnsi="Consolas"/>
+          <w:sz w:val="16"/>
+          <w:szCs w:val="16"/>
+        </w:rPr>
+        <w:t xml:space="preserve">LEFT JOIN urnBilgi ub220                    WITH (NOLOCK) ON ub220.bVeriID = u.stkID AND ub220.bBilgiID = 220 AND ub220.bDeger = 'True'   -- DÜZELTME S-2</w:t>
+      </w:r>
+    </w:p>
+    <w:p>
+      <w:pPr>
+        <w:shd w:fill="F4F4F4" w:color="auto" w:val="clear"/>
+        <w:spacing w:after="0"/>
+      </w:pPr>
+      <w:r>
+        <w:rPr>
+          <w:rFonts w:ascii="Consolas" w:cs="Consolas" w:eastAsia="Consolas" w:hAnsi="Consolas"/>
+          <w:sz w:val="16"/>
+          <w:szCs w:val="16"/>
+        </w:rPr>
+        <w:t xml:space="preserve">LEFT JOIN urnBilgi ub228                    WITH (NOLOCK) ON ub228.bVeriID = u.stkID AND ub228.bBilgiID = 228 AND ub228.bDeger = 'True'   -- DÜZELTME S-1</w:t>
+      </w:r>
+    </w:p>
+    <w:p>
+      <w:pPr>
+        <w:shd w:fill="F4F4F4" w:color="auto" w:val="clear"/>
+        <w:spacing w:after="0"/>
+      </w:pPr>
+      <w:r>
+        <w:rPr>
+          <w:rFonts w:ascii="Consolas" w:cs="Consolas" w:eastAsia="Consolas" w:hAnsi="Consolas"/>
+          <w:sz w:val="16"/>
+          <w:szCs w:val="16"/>
+        </w:rPr>
+        <w:t xml:space="preserve">WHERE sno = 1</w:t>
+      </w:r>
+    </w:p>
+    <w:p>
+      <w:pPr>
+        <w:shd w:fill="F4F4F4" w:color="auto" w:val="clear"/>
+        <w:spacing w:after="0"/>
+      </w:pPr>
+      <w:r>
+        <w:rPr>
+          <w:rFonts w:ascii="Consolas" w:cs="Consolas" w:eastAsia="Consolas" w:hAnsi="Consolas"/>
+          <w:sz w:val="16"/>
+          <w:szCs w:val="16"/>
+        </w:rPr>
+        <w:t xml:space="preserve">  AND fInd1 &lt;&gt; ISNULL(mar.discount,0)</w:t>
+      </w:r>
+    </w:p>
+    <w:p>
+      <w:pPr>
+        <w:shd w:fill="F4F4F4" w:color="auto" w:val="clear"/>
+        <w:spacing w:after="0"/>
+      </w:pPr>
+      <w:r>
+        <w:rPr>
+          <w:rFonts w:ascii="Consolas" w:cs="Consolas" w:eastAsia="Consolas" w:hAnsi="Consolas"/>
+          <w:sz w:val="16"/>
+          <w:szCs w:val="16"/>
+        </w:rPr>
+        <w:t xml:space="preserve">  AND temp.stkID IS NULL</w:t>
+      </w:r>
+    </w:p>
+    <w:p>
+      <w:pPr>
+        <w:shd w:fill="F4F4F4" w:color="auto" w:val="clear"/>
+        <w:spacing w:after="0"/>
+      </w:pPr>
+      <w:r>
+        <w:rPr>
+          <w:rFonts w:ascii="Consolas" w:cs="Consolas" w:eastAsia="Consolas" w:hAnsi="Consolas"/>
+          <w:sz w:val="16"/>
+          <w:szCs w:val="16"/>
+        </w:rPr>
+        <w:t xml:space="preserve">  AND ub220.bVeriID IS NULL          -- DÜZELTME S-2: "Odak Fiyat Güncellenmesin" bu blokta da geçerli</w:t>
+      </w:r>
+    </w:p>
+    <w:p>
+      <w:pPr>
+        <w:shd w:fill="F4F4F4" w:color="auto" w:val="clear"/>
+        <w:spacing w:after="0"/>
+      </w:pPr>
+      <w:r>
+        <w:rPr>
+          <w:rFonts w:ascii="Consolas" w:cs="Consolas" w:eastAsia="Consolas" w:hAnsi="Consolas"/>
+          <w:sz w:val="16"/>
+          <w:szCs w:val="16"/>
+        </w:rPr>
+        <w:t xml:space="preserve">  AND ub228.bVeriID IS NULL          -- DÜZELTME S-1: alış satırı yazılmayan üründe iskonto kıyası hiç kapanmaz</w:t>
+      </w:r>
+    </w:p>
+    <w:p>
+      <w:pPr>
+        <w:shd w:fill="F4F4F4" w:color="auto" w:val="clear"/>
+        <w:spacing w:after="0"/>
+      </w:pPr>
+      <w:r>
+        <w:rPr>
+          <w:rFonts w:ascii="Consolas" w:cs="Consolas" w:eastAsia="Consolas" w:hAnsi="Consolas"/>
+          <w:sz w:val="16"/>
+          <w:szCs w:val="16"/>
+        </w:rPr>
+        <w:t xml:space="preserve">  AND odak.SilinecekUrun = 0         -- birinci bloktaki (satır 56–57) korumalar</w:t>
+      </w:r>
+    </w:p>
+    <w:p>
+      <w:pPr>
+        <w:shd w:fill="F4F4F4" w:color="auto" w:val="clear"/>
+        <w:spacing w:after="0"/>
+      </w:pPr>
+      <w:r>
+        <w:rPr>
+          <w:rFonts w:ascii="Consolas" w:cs="Consolas" w:eastAsia="Consolas" w:hAnsi="Consolas"/>
+          <w:sz w:val="16"/>
+          <w:szCs w:val="16"/>
+        </w:rPr>
+        <w:t xml:space="preserve">  AND odak.etiket_fiyat &lt; 999999;</w:t>
       </w:r>
     </w:p>
     <w:p>
@@ -14262,7 +15355,7 @@
           <w:sz w:val="17"/>
           <w:szCs w:val="17"/>
         </w:rPr>
-        <w:t xml:space="preserve">Kod:</w:t>
+        <w:t xml:space="preserve">Mevcut kod:</w:t>
       </w:r>
     </w:p>
     <w:p>
@@ -14277,6 +15370,206 @@
           <w:szCs w:val="16"/>
         </w:rPr>
         <w:t xml:space="preserve">49| INNER JOIN urnFrm ON stkId=urnFrmStkID AND urnFrm.urnFrmEtkin=1</w:t>
+      </w:r>
+    </w:p>
+    <w:p>
+      <w:pPr>
+        <w:spacing w:after="40" w:before="100"/>
+      </w:pPr>
+      <w:r>
+        <w:rPr>
+          <w:rFonts w:ascii="Calibri" w:cs="Calibri" w:eastAsia="Calibri" w:hAnsi="Calibri"/>
+          <w:b/>
+          <w:bCs/>
+          <w:color w:val="1E7B34"/>
+          <w:sz w:val="17"/>
+          <w:szCs w:val="17"/>
+        </w:rPr>
+        <w:t xml:space="preserve">Önerilen düzeltme:</w:t>
+      </w:r>
+    </w:p>
+    <w:p>
+      <w:pPr>
+        <w:spacing w:after="40"/>
+      </w:pPr>
+      <w:r>
+        <w:rPr>
+          <w:rFonts w:ascii="Calibri" w:cs="Calibri" w:eastAsia="Calibri" w:hAnsi="Calibri"/>
+          <w:i/>
+          <w:iCs/>
+          <w:color w:val="555555"/>
+          <w:sz w:val="17"/>
+          <w:szCs w:val="17"/>
+        </w:rPr>
+        <w:t xml:space="preserve">Etki: temp tabloya bağlı, SELECT karşılığı kurulamadı. Hedef: aynı ürün-gün 323.590 tekrar satış satırı → 0; değişmeyen fiyat için satış satırı yazılmaz.</w:t>
+      </w:r>
+    </w:p>
+    <w:p>
+      <w:pPr>
+        <w:shd w:fill="F4F4F4" w:color="auto" w:val="clear"/>
+        <w:spacing w:after="0"/>
+      </w:pPr>
+      <w:r>
+        <w:rPr>
+          <w:rFonts w:ascii="Consolas" w:cs="Consolas" w:eastAsia="Consolas" w:hAnsi="Consolas"/>
+          <w:sz w:val="16"/>
+          <w:szCs w:val="16"/>
+        </w:rPr>
+        <w:t xml:space="preserve">SELECT i.feID, t.stkID, dbo.fn_tarih(null), 0, t.fiyatS, t.etiket_fiyat, 0, 0, 0, t.etiket_fiyat,</w:t>
+      </w:r>
+    </w:p>
+    <w:p>
+      <w:pPr>
+        <w:shd w:fill="F4F4F4" w:color="auto" w:val="clear"/>
+        <w:spacing w:after="0"/>
+      </w:pPr>
+      <w:r>
+        <w:rPr>
+          <w:rFonts w:ascii="Consolas" w:cs="Consolas" w:eastAsia="Consolas" w:hAnsi="Consolas"/>
+          <w:sz w:val="16"/>
+          <w:szCs w:val="16"/>
+        </w:rPr>
+        <w:t xml:space="preserve">       @kisi, ROW_NUMBER() OVER (PARTITION BY i.feID ORDER BY t.stkID), dbo.fn_tarih(null), t.firmaID, 1</w:t>
+      </w:r>
+    </w:p>
+    <w:p>
+      <w:pPr>
+        <w:shd w:fill="F4F4F4" w:color="auto" w:val="clear"/>
+        <w:spacing w:after="0"/>
+      </w:pPr>
+      <w:r>
+        <w:rPr>
+          <w:rFonts w:ascii="Consolas" w:cs="Consolas" w:eastAsia="Consolas" w:hAnsi="Consolas"/>
+          <w:sz w:val="16"/>
+          <w:szCs w:val="16"/>
+        </w:rPr>
+        <w:t xml:space="preserve">FROM (SELECT x.*, ROW_NUMBER() OVER (PARTITION BY x.stkID</w:t>
+      </w:r>
+    </w:p>
+    <w:p>
+      <w:pPr>
+        <w:shd w:fill="F4F4F4" w:color="auto" w:val="clear"/>
+        <w:spacing w:after="0"/>
+      </w:pPr>
+      <w:r>
+        <w:rPr>
+          <w:rFonts w:ascii="Consolas" w:cs="Consolas" w:eastAsia="Consolas" w:hAnsi="Consolas"/>
+          <w:sz w:val="16"/>
+          <w:szCs w:val="16"/>
+        </w:rPr>
+        <w:t xml:space="preserve">                                     ORDER BY CASE WHEN x.firmaID = 9525 THEN 0 ELSE 1 END, x.firmaID) rn</w:t>
+      </w:r>
+    </w:p>
+    <w:p>
+      <w:pPr>
+        <w:shd w:fill="F4F4F4" w:color="auto" w:val="clear"/>
+        <w:spacing w:after="0"/>
+      </w:pPr>
+      <w:r>
+        <w:rPr>
+          <w:rFonts w:ascii="Consolas" w:cs="Consolas" w:eastAsia="Consolas" w:hAnsi="Consolas"/>
+          <w:sz w:val="16"/>
+          <w:szCs w:val="16"/>
+        </w:rPr>
+        <w:t xml:space="preserve">      FROM #odakFiyatTemp x) t                                       -- DÜZELTME S-3: ürün başına tek satış satırı</w:t>
+      </w:r>
+    </w:p>
+    <w:p>
+      <w:pPr>
+        <w:shd w:fill="F4F4F4" w:color="auto" w:val="clear"/>
+        <w:spacing w:after="0"/>
+      </w:pPr>
+      <w:r>
+        <w:rPr>
+          <w:rFonts w:ascii="Consolas" w:cs="Consolas" w:eastAsia="Consolas" w:hAnsi="Consolas"/>
+          <w:sz w:val="16"/>
+          <w:szCs w:val="16"/>
+        </w:rPr>
+        <w:t xml:space="preserve">INNER JOIN frm    WITH (NOLOCK) ON frmID = t.firmaID</w:t>
+      </w:r>
+    </w:p>
+    <w:p>
+      <w:pPr>
+        <w:shd w:fill="F4F4F4" w:color="auto" w:val="clear"/>
+        <w:spacing w:after="0"/>
+      </w:pPr>
+      <w:r>
+        <w:rPr>
+          <w:rFonts w:ascii="Consolas" w:cs="Consolas" w:eastAsia="Consolas" w:hAnsi="Consolas"/>
+          <w:sz w:val="16"/>
+          <w:szCs w:val="16"/>
+        </w:rPr>
+        <w:t xml:space="preserve">INNER JOIN urnFrm WITH (NOLOCK) ON urnFrmStkID = t.stkID AND urnFrmFirmaID = t.firmaID</w:t>
+      </w:r>
+    </w:p>
+    <w:p>
+      <w:pPr>
+        <w:shd w:fill="F4F4F4" w:color="auto" w:val="clear"/>
+        <w:spacing w:after="0"/>
+      </w:pPr>
+      <w:r>
+        <w:rPr>
+          <w:rFonts w:ascii="Consolas" w:cs="Consolas" w:eastAsia="Consolas" w:hAnsi="Consolas"/>
+          <w:sz w:val="16"/>
+          <w:szCs w:val="16"/>
+        </w:rPr>
+        <w:t xml:space="preserve">INNER JOIN fytB   WITH (NOLOCK) ON SUBSTRING(frmAd,1,10)+' Odak2 Ent' = feNot AND t.firmaID = feFrmID AND feOnay = 1</w:t>
+      </w:r>
+    </w:p>
+    <w:p>
+      <w:pPr>
+        <w:shd w:fill="F4F4F4" w:color="auto" w:val="clear"/>
+        <w:spacing w:after="0"/>
+      </w:pPr>
+      <w:r>
+        <w:rPr>
+          <w:rFonts w:ascii="Consolas" w:cs="Consolas" w:eastAsia="Consolas" w:hAnsi="Consolas"/>
+          <w:sz w:val="16"/>
+          <w:szCs w:val="16"/>
+        </w:rPr>
+        <w:t xml:space="preserve">        AND feTarihA = dbo.fn_tarih(null) AND feTarihAson = feTarihA AND feTarihS = feTarihA AND feTarihSson = feTarihA</w:t>
+      </w:r>
+    </w:p>
+    <w:p>
+      <w:pPr>
+        <w:shd w:fill="F4F4F4" w:color="auto" w:val="clear"/>
+        <w:spacing w:after="0"/>
+      </w:pPr>
+      <w:r>
+        <w:rPr>
+          <w:rFonts w:ascii="Consolas" w:cs="Consolas" w:eastAsia="Consolas" w:hAnsi="Consolas"/>
+          <w:sz w:val="16"/>
+          <w:szCs w:val="16"/>
+        </w:rPr>
+        <w:t xml:space="preserve">JOIN #inserted AS i ON i.feID = fytB.feID AND i.feNot = fytB.feNot AND i.feFrmID = fytB.feFrmID</w:t>
+      </w:r>
+    </w:p>
+    <w:p>
+      <w:pPr>
+        <w:shd w:fill="F4F4F4" w:color="auto" w:val="clear"/>
+        <w:spacing w:after="0"/>
+      </w:pPr>
+      <w:r>
+        <w:rPr>
+          <w:rFonts w:ascii="Consolas" w:cs="Consolas" w:eastAsia="Consolas" w:hAnsi="Consolas"/>
+          <w:sz w:val="16"/>
+          <w:szCs w:val="16"/>
+        </w:rPr>
+        <w:t xml:space="preserve">WHERE t.rn = 1</w:t>
+      </w:r>
+    </w:p>
+    <w:p>
+      <w:pPr>
+        <w:shd w:fill="F4F4F4" w:color="auto" w:val="clear"/>
+        <w:spacing w:after="0"/>
+      </w:pPr>
+      <w:r>
+        <w:rPr>
+          <w:rFonts w:ascii="Consolas" w:cs="Consolas" w:eastAsia="Consolas" w:hAnsi="Consolas"/>
+          <w:sz w:val="16"/>
+          <w:szCs w:val="16"/>
+        </w:rPr>
+        <w:t xml:space="preserve">  AND t.fiyatS &lt;&gt; t.etiket_fiyat;                                   -- DÜZELTME S-1: fiyat değişmiyorsa satış satırı yok</w:t>
       </w:r>
     </w:p>
     <w:p>
@@ -14701,7 +15994,7 @@
           <w:sz w:val="17"/>
           <w:szCs w:val="17"/>
         </w:rPr>
-        <w:t xml:space="preserve">Kod:</w:t>
+        <w:t xml:space="preserve">Mevcut kod:</w:t>
       </w:r>
     </w:p>
     <w:p>
@@ -14744,6 +16037,164 @@
           <w:szCs w:val="16"/>
         </w:rPr>
         <w:t xml:space="preserve">219| AND IIF(odak.kategori_id_2 ='001007002', ...) &lt;&gt;bDeger</w:t>
+      </w:r>
+    </w:p>
+    <w:p>
+      <w:pPr>
+        <w:spacing w:after="40" w:before="100"/>
+      </w:pPr>
+      <w:r>
+        <w:rPr>
+          <w:rFonts w:ascii="Calibri" w:cs="Calibri" w:eastAsia="Calibri" w:hAnsi="Calibri"/>
+          <w:b/>
+          <w:bCs/>
+          <w:color w:val="1E7B34"/>
+          <w:sz w:val="17"/>
+          <w:szCs w:val="17"/>
+        </w:rPr>
+        <w:t xml:space="preserve">Önerilen düzeltme:</w:t>
+      </w:r>
+    </w:p>
+    <w:p>
+      <w:pPr>
+        <w:spacing w:after="40"/>
+      </w:pPr>
+      <w:r>
+        <w:rPr>
+          <w:rFonts w:ascii="Calibri" w:cs="Calibri" w:eastAsia="Calibri" w:hAnsi="Calibri"/>
+          <w:i/>
+          <w:iCs/>
+          <w:color w:val="555555"/>
+          <w:sz w:val="17"/>
+          <w:szCs w:val="17"/>
+        </w:rPr>
+        <w:t xml:space="preserve">Etki(ölçüldü): ilk koşumda 599.096 web adı satırı eklenir; aynı stkID'ye birden çok satır riski 0.</w:t>
+      </w:r>
+    </w:p>
+    <w:p>
+      <w:pPr>
+        <w:shd w:fill="F4F4F4" w:color="auto" w:val="clear"/>
+        <w:spacing w:after="0"/>
+      </w:pPr>
+      <w:r>
+        <w:rPr>
+          <w:rFonts w:ascii="Consolas" w:cs="Consolas" w:eastAsia="Consolas" w:hAnsi="Consolas"/>
+          <w:sz w:val="16"/>
+          <w:szCs w:val="16"/>
+        </w:rPr>
+        <w:t xml:space="preserve">INSERT INTO urnBilgi (bBilgiID, bVeriID, bDeger)</w:t>
+      </w:r>
+    </w:p>
+    <w:p>
+      <w:pPr>
+        <w:shd w:fill="F4F4F4" w:color="auto" w:val="clear"/>
+        <w:spacing w:after="0"/>
+      </w:pPr>
+      <w:r>
+        <w:rPr>
+          <w:rFonts w:ascii="Consolas" w:cs="Consolas" w:eastAsia="Consolas" w:hAnsi="Consolas"/>
+          <w:sz w:val="16"/>
+          <w:szCs w:val="16"/>
+        </w:rPr>
+        <w:t xml:space="preserve">SELECT 10, urn.stkID, IIF(odak.kategori_id_2 = '001007002', odak.marka_ad + ' ' + odak.urun_ad, odak.urun_ad)</w:t>
+      </w:r>
+    </w:p>
+    <w:p>
+      <w:pPr>
+        <w:shd w:fill="F4F4F4" w:color="auto" w:val="clear"/>
+        <w:spacing w:after="0"/>
+      </w:pPr>
+      <w:r>
+        <w:rPr>
+          <w:rFonts w:ascii="Consolas" w:cs="Consolas" w:eastAsia="Consolas" w:hAnsi="Consolas"/>
+          <w:sz w:val="16"/>
+          <w:szCs w:val="16"/>
+        </w:rPr>
+        <w:t xml:space="preserve">FROM urn WITH (NOLOCK)</w:t>
+      </w:r>
+    </w:p>
+    <w:p>
+      <w:pPr>
+        <w:shd w:fill="F4F4F4" w:color="auto" w:val="clear"/>
+        <w:spacing w:after="0"/>
+      </w:pPr>
+      <w:r>
+        <w:rPr>
+          <w:rFonts w:ascii="Consolas" w:cs="Consolas" w:eastAsia="Consolas" w:hAnsi="Consolas"/>
+          <w:sz w:val="16"/>
+          <w:szCs w:val="16"/>
+        </w:rPr>
+        <w:t xml:space="preserve">JOIN urnBrkd AS bar                    WITH (NOLOCK) ON bar.urnBrkdStkID = urn.stkID</w:t>
+      </w:r>
+    </w:p>
+    <w:p>
+      <w:pPr>
+        <w:shd w:fill="F4F4F4" w:color="auto" w:val="clear"/>
+        <w:spacing w:after="0"/>
+      </w:pPr>
+      <w:r>
+        <w:rPr>
+          <w:rFonts w:ascii="Consolas" w:cs="Consolas" w:eastAsia="Consolas" w:hAnsi="Consolas"/>
+          <w:sz w:val="16"/>
+          <w:szCs w:val="16"/>
+        </w:rPr>
+        <w:t xml:space="preserve">INNER JOIN BKMDATA.ent.odak_urun_tam odak WITH (NOLOCK) ON odak.barkod = bar.urnBarkod</w:t>
+      </w:r>
+    </w:p>
+    <w:p>
+      <w:pPr>
+        <w:shd w:fill="F4F4F4" w:color="auto" w:val="clear"/>
+        <w:spacing w:after="0"/>
+      </w:pPr>
+      <w:r>
+        <w:rPr>
+          <w:rFonts w:ascii="Consolas" w:cs="Consolas" w:eastAsia="Consolas" w:hAnsi="Consolas"/>
+          <w:sz w:val="16"/>
+          <w:szCs w:val="16"/>
+        </w:rPr>
+        <w:t xml:space="preserve">LEFT JOIN urnBilgi ubilgi              WITH (NOLOCK) ON ubilgi.bVeriID = urn.stkID AND ubilgi.bBilgiID = 10</w:t>
+      </w:r>
+    </w:p>
+    <w:p>
+      <w:pPr>
+        <w:shd w:fill="F4F4F4" w:color="auto" w:val="clear"/>
+        <w:spacing w:after="0"/>
+      </w:pPr>
+      <w:r>
+        <w:rPr>
+          <w:rFonts w:ascii="Consolas" w:cs="Consolas" w:eastAsia="Consolas" w:hAnsi="Consolas"/>
+          <w:sz w:val="16"/>
+          <w:szCs w:val="16"/>
+        </w:rPr>
+        <w:t xml:space="preserve">WHERE ubilgi.bBilgiID IS NULL</w:t>
+      </w:r>
+    </w:p>
+    <w:p>
+      <w:pPr>
+        <w:shd w:fill="F4F4F4" w:color="auto" w:val="clear"/>
+        <w:spacing w:after="0"/>
+      </w:pPr>
+      <w:r>
+        <w:rPr>
+          <w:rFonts w:ascii="Consolas" w:cs="Consolas" w:eastAsia="Consolas" w:hAnsi="Consolas"/>
+          <w:sz w:val="16"/>
+          <w:szCs w:val="16"/>
+        </w:rPr>
+        <w:t xml:space="preserve">  AND odak.SilinecekUrun = 0</w:t>
+      </w:r>
+    </w:p>
+    <w:p>
+      <w:pPr>
+        <w:shd w:fill="F4F4F4" w:color="auto" w:val="clear"/>
+        <w:spacing w:after="0"/>
+      </w:pPr>
+      <w:r>
+        <w:rPr>
+          <w:rFonts w:ascii="Consolas" w:cs="Consolas" w:eastAsia="Consolas" w:hAnsi="Consolas"/>
+          <w:sz w:val="16"/>
+          <w:szCs w:val="16"/>
+        </w:rPr>
+        <w:t xml:space="preserve">  AND urn.stkID NOT IN (SELECT urnBrkdStkID FROM bkm.CiftUrunlerMaxFyat);   -- DÜZELTME: satır 219 yerine çift ürün süzgeci</w:t>
       </w:r>
     </w:p>
     <w:p>
@@ -15168,7 +16619,7 @@
           <w:sz w:val="17"/>
           <w:szCs w:val="17"/>
         </w:rPr>
-        <w:t xml:space="preserve">Kod:</w:t>
+        <w:t xml:space="preserve">Mevcut kod:</w:t>
       </w:r>
     </w:p>
     <w:p>
@@ -15197,6 +16648,434 @@
           <w:szCs w:val="16"/>
         </w:rPr>
         <w:t xml:space="preserve">391| inner join BKMDATA.ent.odak_urun_tam odak on barkod=stkKod</w:t>
+      </w:r>
+    </w:p>
+    <w:p>
+      <w:pPr>
+        <w:spacing w:after="40" w:before="100"/>
+      </w:pPr>
+      <w:r>
+        <w:rPr>
+          <w:rFonts w:ascii="Calibri" w:cs="Calibri" w:eastAsia="Calibri" w:hAnsi="Calibri"/>
+          <w:b/>
+          <w:bCs/>
+          <w:color w:val="1E7B34"/>
+          <w:sz w:val="17"/>
+          <w:szCs w:val="17"/>
+        </w:rPr>
+        <w:t xml:space="preserve">Önerilen düzeltme (S-5a):</w:t>
+      </w:r>
+    </w:p>
+    <w:p>
+      <w:pPr>
+        <w:spacing w:after="40"/>
+      </w:pPr>
+      <w:r>
+        <w:rPr>
+          <w:rFonts w:ascii="Calibri" w:cs="Calibri" w:eastAsia="Calibri" w:hAnsi="Calibri"/>
+          <w:i/>
+          <w:iCs/>
+          <w:color w:val="555555"/>
+          <w:sz w:val="17"/>
+          <w:szCs w:val="17"/>
+        </w:rPr>
+        <w:t xml:space="preserve">Etki(ölçüldü): 193 → 2.360 · 192 → 115 · 191 → 62 satır güncellenir (bulgudaki sapmayla birebir).</w:t>
+      </w:r>
+    </w:p>
+    <w:p>
+      <w:pPr>
+        <w:shd w:fill="F4F4F4" w:color="auto" w:val="clear"/>
+        <w:spacing w:after="0"/>
+      </w:pPr>
+      <w:r>
+        <w:rPr>
+          <w:rFonts w:ascii="Consolas" w:cs="Consolas" w:eastAsia="Consolas" w:hAnsi="Consolas"/>
+          <w:sz w:val="16"/>
+          <w:szCs w:val="16"/>
+        </w:rPr>
+        <w:t xml:space="preserve">UPDATE bilgialtbaslik SET bilgialtbaslik.bDeger = CONVERT(varchar(10), odak.basim_tarihi_yil)</w:t>
+      </w:r>
+    </w:p>
+    <w:p>
+      <w:pPr>
+        <w:shd w:fill="F4F4F4" w:color="auto" w:val="clear"/>
+        <w:spacing w:after="0"/>
+      </w:pPr>
+      <w:r>
+        <w:rPr>
+          <w:rFonts w:ascii="Consolas" w:cs="Consolas" w:eastAsia="Consolas" w:hAnsi="Consolas"/>
+          <w:sz w:val="16"/>
+          <w:szCs w:val="16"/>
+        </w:rPr>
+        <w:t xml:space="preserve">FROM urn WITH (NOLOCK)</w:t>
+      </w:r>
+    </w:p>
+    <w:p>
+      <w:pPr>
+        <w:shd w:fill="F4F4F4" w:color="auto" w:val="clear"/>
+        <w:spacing w:after="0"/>
+      </w:pPr>
+      <w:r>
+        <w:rPr>
+          <w:rFonts w:ascii="Consolas" w:cs="Consolas" w:eastAsia="Consolas" w:hAnsi="Consolas"/>
+          <w:sz w:val="16"/>
+          <w:szCs w:val="16"/>
+        </w:rPr>
+        <w:t xml:space="preserve">JOIN urnBrkd AS bar                       WITH (NOLOCK) ON bar.urnBrkdStkID = urn.stkID        -- DÜZELTME</w:t>
+      </w:r>
+    </w:p>
+    <w:p>
+      <w:pPr>
+        <w:shd w:fill="F4F4F4" w:color="auto" w:val="clear"/>
+        <w:spacing w:after="0"/>
+      </w:pPr>
+      <w:r>
+        <w:rPr>
+          <w:rFonts w:ascii="Consolas" w:cs="Consolas" w:eastAsia="Consolas" w:hAnsi="Consolas"/>
+          <w:sz w:val="16"/>
+          <w:szCs w:val="16"/>
+        </w:rPr>
+        <w:t xml:space="preserve">INNER JOIN BKMDATA.ent.odak_urun_tam odak WITH (NOLOCK) ON odak.barkod = bar.urnBarkod         -- DÜZELTME (eski: barkod=stkKod)</w:t>
+      </w:r>
+    </w:p>
+    <w:p>
+      <w:pPr>
+        <w:shd w:fill="F4F4F4" w:color="auto" w:val="clear"/>
+        <w:spacing w:after="0"/>
+      </w:pPr>
+      <w:r>
+        <w:rPr>
+          <w:rFonts w:ascii="Consolas" w:cs="Consolas" w:eastAsia="Consolas" w:hAnsi="Consolas"/>
+          <w:sz w:val="16"/>
+          <w:szCs w:val="16"/>
+        </w:rPr>
+        <w:t xml:space="preserve">INNER JOIN urnBilgi AS bilgialtbaslik     WITH (ROWLOCK) ON bilgialtbaslik.bVeriID = urn.stkID AND bilgialtbaslik.bBilgiID = 193</w:t>
+      </w:r>
+    </w:p>
+    <w:p>
+      <w:pPr>
+        <w:shd w:fill="F4F4F4" w:color="auto" w:val="clear"/>
+        <w:spacing w:after="0"/>
+      </w:pPr>
+      <w:r>
+        <w:rPr>
+          <w:rFonts w:ascii="Consolas" w:cs="Consolas" w:eastAsia="Consolas" w:hAnsi="Consolas"/>
+          <w:sz w:val="16"/>
+          <w:szCs w:val="16"/>
+        </w:rPr>
+        <w:t xml:space="preserve">WHERE odak.basim_tarihi_yil &lt;&gt; 0</w:t>
+      </w:r>
+    </w:p>
+    <w:p>
+      <w:pPr>
+        <w:shd w:fill="F4F4F4" w:color="auto" w:val="clear"/>
+        <w:spacing w:after="0"/>
+      </w:pPr>
+      <w:r>
+        <w:rPr>
+          <w:rFonts w:ascii="Consolas" w:cs="Consolas" w:eastAsia="Consolas" w:hAnsi="Consolas"/>
+          <w:sz w:val="16"/>
+          <w:szCs w:val="16"/>
+        </w:rPr>
+        <w:t xml:space="preserve">  AND odak.SilinecekUrun = 0</w:t>
+      </w:r>
+    </w:p>
+    <w:p>
+      <w:pPr>
+        <w:shd w:fill="F4F4F4" w:color="auto" w:val="clear"/>
+        <w:spacing w:after="0"/>
+      </w:pPr>
+      <w:r>
+        <w:rPr>
+          <w:rFonts w:ascii="Consolas" w:cs="Consolas" w:eastAsia="Consolas" w:hAnsi="Consolas"/>
+          <w:sz w:val="16"/>
+          <w:szCs w:val="16"/>
+        </w:rPr>
+        <w:t xml:space="preserve">  AND ISNULL(TRY_CONVERT(int, bilgialtbaslik.bDeger), -1) &lt;&gt; odak.basim_tarihi_yil</w:t>
+      </w:r>
+    </w:p>
+    <w:p>
+      <w:pPr>
+        <w:shd w:fill="F4F4F4" w:color="auto" w:val="clear"/>
+        <w:spacing w:after="0"/>
+      </w:pPr>
+      <w:r>
+        <w:rPr>
+          <w:rFonts w:ascii="Consolas" w:cs="Consolas" w:eastAsia="Consolas" w:hAnsi="Consolas"/>
+          <w:sz w:val="16"/>
+          <w:szCs w:val="16"/>
+        </w:rPr>
+        <w:t xml:space="preserve">  AND urn.stkID NOT IN (SELECT urnBrkdStkID FROM bkm.CiftUrunlerMaxFyat);</w:t>
+      </w:r>
+    </w:p>
+    <w:p>
+      <w:pPr>
+        <w:spacing w:after="40" w:before="100"/>
+      </w:pPr>
+      <w:r>
+        <w:rPr>
+          <w:rFonts w:ascii="Calibri" w:cs="Calibri" w:eastAsia="Calibri" w:hAnsi="Calibri"/>
+          <w:b/>
+          <w:bCs/>
+          <w:color w:val="1E7B34"/>
+          <w:sz w:val="17"/>
+          <w:szCs w:val="17"/>
+        </w:rPr>
+        <w:t xml:space="preserve">Önerilen düzeltme (S-5b):</w:t>
+      </w:r>
+    </w:p>
+    <w:p>
+      <w:pPr>
+        <w:shd w:fill="F4F4F4" w:color="auto" w:val="clear"/>
+        <w:spacing w:after="0"/>
+      </w:pPr>
+      <w:r>
+        <w:rPr>
+          <w:rFonts w:ascii="Consolas" w:cs="Consolas" w:eastAsia="Consolas" w:hAnsi="Consolas"/>
+          <w:sz w:val="16"/>
+          <w:szCs w:val="16"/>
+        </w:rPr>
+        <w:t xml:space="preserve">UPDATE bilgialtbaslik SET bilgialtbaslik.bDeger = CONVERT(varchar(10), odak.basim_sayisi)</w:t>
+      </w:r>
+    </w:p>
+    <w:p>
+      <w:pPr>
+        <w:shd w:fill="F4F4F4" w:color="auto" w:val="clear"/>
+        <w:spacing w:after="0"/>
+      </w:pPr>
+      <w:r>
+        <w:rPr>
+          <w:rFonts w:ascii="Consolas" w:cs="Consolas" w:eastAsia="Consolas" w:hAnsi="Consolas"/>
+          <w:sz w:val="16"/>
+          <w:szCs w:val="16"/>
+        </w:rPr>
+        <w:t xml:space="preserve">FROM urn WITH (NOLOCK)</w:t>
+      </w:r>
+    </w:p>
+    <w:p>
+      <w:pPr>
+        <w:shd w:fill="F4F4F4" w:color="auto" w:val="clear"/>
+        <w:spacing w:after="0"/>
+      </w:pPr>
+      <w:r>
+        <w:rPr>
+          <w:rFonts w:ascii="Consolas" w:cs="Consolas" w:eastAsia="Consolas" w:hAnsi="Consolas"/>
+          <w:sz w:val="16"/>
+          <w:szCs w:val="16"/>
+        </w:rPr>
+        <w:t xml:space="preserve">JOIN urnBrkd AS bar                       WITH (NOLOCK) ON bar.urnBrkdStkID = urn.stkID</w:t>
+      </w:r>
+    </w:p>
+    <w:p>
+      <w:pPr>
+        <w:shd w:fill="F4F4F4" w:color="auto" w:val="clear"/>
+        <w:spacing w:after="0"/>
+      </w:pPr>
+      <w:r>
+        <w:rPr>
+          <w:rFonts w:ascii="Consolas" w:cs="Consolas" w:eastAsia="Consolas" w:hAnsi="Consolas"/>
+          <w:sz w:val="16"/>
+          <w:szCs w:val="16"/>
+        </w:rPr>
+        <w:t xml:space="preserve">INNER JOIN BKMDATA.ent.odak_urun_tam odak WITH (NOLOCK) ON odak.barkod = bar.urnBarkod</w:t>
+      </w:r>
+    </w:p>
+    <w:p>
+      <w:pPr>
+        <w:shd w:fill="F4F4F4" w:color="auto" w:val="clear"/>
+        <w:spacing w:after="0"/>
+      </w:pPr>
+      <w:r>
+        <w:rPr>
+          <w:rFonts w:ascii="Consolas" w:cs="Consolas" w:eastAsia="Consolas" w:hAnsi="Consolas"/>
+          <w:sz w:val="16"/>
+          <w:szCs w:val="16"/>
+        </w:rPr>
+        <w:t xml:space="preserve">INNER JOIN urnBilgi AS bilgialtbaslik     WITH (ROWLOCK) ON bilgialtbaslik.bVeriID = urn.stkID AND bilgialtbaslik.bBilgiID = 192</w:t>
+      </w:r>
+    </w:p>
+    <w:p>
+      <w:pPr>
+        <w:shd w:fill="F4F4F4" w:color="auto" w:val="clear"/>
+        <w:spacing w:after="0"/>
+      </w:pPr>
+      <w:r>
+        <w:rPr>
+          <w:rFonts w:ascii="Consolas" w:cs="Consolas" w:eastAsia="Consolas" w:hAnsi="Consolas"/>
+          <w:sz w:val="16"/>
+          <w:szCs w:val="16"/>
+        </w:rPr>
+        <w:t xml:space="preserve">WHERE ISNULL(odak.basim_sayisi,0) &lt;&gt; 0</w:t>
+      </w:r>
+    </w:p>
+    <w:p>
+      <w:pPr>
+        <w:shd w:fill="F4F4F4" w:color="auto" w:val="clear"/>
+        <w:spacing w:after="0"/>
+      </w:pPr>
+      <w:r>
+        <w:rPr>
+          <w:rFonts w:ascii="Consolas" w:cs="Consolas" w:eastAsia="Consolas" w:hAnsi="Consolas"/>
+          <w:sz w:val="16"/>
+          <w:szCs w:val="16"/>
+        </w:rPr>
+        <w:t xml:space="preserve">  AND odak.SilinecekUrun = 0</w:t>
+      </w:r>
+    </w:p>
+    <w:p>
+      <w:pPr>
+        <w:shd w:fill="F4F4F4" w:color="auto" w:val="clear"/>
+        <w:spacing w:after="0"/>
+      </w:pPr>
+      <w:r>
+        <w:rPr>
+          <w:rFonts w:ascii="Consolas" w:cs="Consolas" w:eastAsia="Consolas" w:hAnsi="Consolas"/>
+          <w:sz w:val="16"/>
+          <w:szCs w:val="16"/>
+        </w:rPr>
+        <w:t xml:space="preserve">  AND ISNULL(TRY_CONVERT(int, bilgialtbaslik.bDeger), -1) &lt;&gt; odak.basim_sayisi</w:t>
+      </w:r>
+    </w:p>
+    <w:p>
+      <w:pPr>
+        <w:shd w:fill="F4F4F4" w:color="auto" w:val="clear"/>
+        <w:spacing w:after="0"/>
+      </w:pPr>
+      <w:r>
+        <w:rPr>
+          <w:rFonts w:ascii="Consolas" w:cs="Consolas" w:eastAsia="Consolas" w:hAnsi="Consolas"/>
+          <w:sz w:val="16"/>
+          <w:szCs w:val="16"/>
+        </w:rPr>
+        <w:t xml:space="preserve">  AND urn.stkID NOT IN (SELECT urnBrkdStkID FROM bkm.CiftUrunlerMaxFyat);</w:t>
+      </w:r>
+    </w:p>
+    <w:p>
+      <w:pPr>
+        <w:spacing w:after="40" w:before="100"/>
+      </w:pPr>
+      <w:r>
+        <w:rPr>
+          <w:rFonts w:ascii="Calibri" w:cs="Calibri" w:eastAsia="Calibri" w:hAnsi="Calibri"/>
+          <w:b/>
+          <w:bCs/>
+          <w:color w:val="1E7B34"/>
+          <w:sz w:val="17"/>
+          <w:szCs w:val="17"/>
+        </w:rPr>
+        <w:t xml:space="preserve">Önerilen düzeltme (S-5c):</w:t>
+      </w:r>
+    </w:p>
+    <w:p>
+      <w:pPr>
+        <w:shd w:fill="F4F4F4" w:color="auto" w:val="clear"/>
+        <w:spacing w:after="0"/>
+      </w:pPr>
+      <w:r>
+        <w:rPr>
+          <w:rFonts w:ascii="Consolas" w:cs="Consolas" w:eastAsia="Consolas" w:hAnsi="Consolas"/>
+          <w:sz w:val="16"/>
+          <w:szCs w:val="16"/>
+        </w:rPr>
+        <w:t xml:space="preserve">UPDATE bilgialtbaslik SET bilgialtbaslik.bDeger = IIF(ISNULL(odak.sayfa_sayisi,0) &gt; 1, CONVERT(varchar(10), odak.sayfa_sayisi), '')</w:t>
+      </w:r>
+    </w:p>
+    <w:p>
+      <w:pPr>
+        <w:shd w:fill="F4F4F4" w:color="auto" w:val="clear"/>
+        <w:spacing w:after="0"/>
+      </w:pPr>
+      <w:r>
+        <w:rPr>
+          <w:rFonts w:ascii="Consolas" w:cs="Consolas" w:eastAsia="Consolas" w:hAnsi="Consolas"/>
+          <w:sz w:val="16"/>
+          <w:szCs w:val="16"/>
+        </w:rPr>
+        <w:t xml:space="preserve">FROM urn WITH (NOLOCK)</w:t>
+      </w:r>
+    </w:p>
+    <w:p>
+      <w:pPr>
+        <w:shd w:fill="F4F4F4" w:color="auto" w:val="clear"/>
+        <w:spacing w:after="0"/>
+      </w:pPr>
+      <w:r>
+        <w:rPr>
+          <w:rFonts w:ascii="Consolas" w:cs="Consolas" w:eastAsia="Consolas" w:hAnsi="Consolas"/>
+          <w:sz w:val="16"/>
+          <w:szCs w:val="16"/>
+        </w:rPr>
+        <w:t xml:space="preserve">JOIN urnBrkd AS bar                       WITH (NOLOCK) ON bar.urnBrkdStkID = urn.stkID</w:t>
+      </w:r>
+    </w:p>
+    <w:p>
+      <w:pPr>
+        <w:shd w:fill="F4F4F4" w:color="auto" w:val="clear"/>
+        <w:spacing w:after="0"/>
+      </w:pPr>
+      <w:r>
+        <w:rPr>
+          <w:rFonts w:ascii="Consolas" w:cs="Consolas" w:eastAsia="Consolas" w:hAnsi="Consolas"/>
+          <w:sz w:val="16"/>
+          <w:szCs w:val="16"/>
+        </w:rPr>
+        <w:t xml:space="preserve">INNER JOIN BKMDATA.ent.odak_urun_tam odak WITH (NOLOCK) ON odak.barkod = bar.urnBarkod</w:t>
+      </w:r>
+    </w:p>
+    <w:p>
+      <w:pPr>
+        <w:shd w:fill="F4F4F4" w:color="auto" w:val="clear"/>
+        <w:spacing w:after="0"/>
+      </w:pPr>
+      <w:r>
+        <w:rPr>
+          <w:rFonts w:ascii="Consolas" w:cs="Consolas" w:eastAsia="Consolas" w:hAnsi="Consolas"/>
+          <w:sz w:val="16"/>
+          <w:szCs w:val="16"/>
+        </w:rPr>
+        <w:t xml:space="preserve">INNER JOIN urnBilgi AS bilgialtbaslik     WITH (ROWLOCK) ON bilgialtbaslik.bVeriID = urn.stkID AND bilgialtbaslik.bBilgiID = 191</w:t>
+      </w:r>
+    </w:p>
+    <w:p>
+      <w:pPr>
+        <w:shd w:fill="F4F4F4" w:color="auto" w:val="clear"/>
+        <w:spacing w:after="0"/>
+      </w:pPr>
+      <w:r>
+        <w:rPr>
+          <w:rFonts w:ascii="Consolas" w:cs="Consolas" w:eastAsia="Consolas" w:hAnsi="Consolas"/>
+          <w:sz w:val="16"/>
+          <w:szCs w:val="16"/>
+        </w:rPr>
+        <w:t xml:space="preserve">WHERE odak.SilinecekUrun = 0</w:t>
+      </w:r>
+    </w:p>
+    <w:p>
+      <w:pPr>
+        <w:shd w:fill="F4F4F4" w:color="auto" w:val="clear"/>
+        <w:spacing w:after="0"/>
+      </w:pPr>
+      <w:r>
+        <w:rPr>
+          <w:rFonts w:ascii="Consolas" w:cs="Consolas" w:eastAsia="Consolas" w:hAnsi="Consolas"/>
+          <w:sz w:val="16"/>
+          <w:szCs w:val="16"/>
+        </w:rPr>
+        <w:t xml:space="preserve">  AND bilgialtbaslik.bDeger &lt;&gt; IIF(ISNULL(odak.sayfa_sayisi,0) &gt; 1, CONVERT(varchar(10), odak.sayfa_sayisi), '')</w:t>
+      </w:r>
+    </w:p>
+    <w:p>
+      <w:pPr>
+        <w:shd w:fill="F4F4F4" w:color="auto" w:val="clear"/>
+        <w:spacing w:after="0"/>
+      </w:pPr>
+      <w:r>
+        <w:rPr>
+          <w:rFonts w:ascii="Consolas" w:cs="Consolas" w:eastAsia="Consolas" w:hAnsi="Consolas"/>
+          <w:sz w:val="16"/>
+          <w:szCs w:val="16"/>
+        </w:rPr>
+        <w:t xml:space="preserve">  AND urn.stkID NOT IN (SELECT urnBrkdStkID FROM bkm.CiftUrunlerMaxFyat);</w:t>
       </w:r>
     </w:p>
     <w:p>
@@ -15602,7 +17481,7 @@
           <w:sz w:val="17"/>
           <w:szCs w:val="17"/>
         </w:rPr>
-        <w:t xml:space="preserve">Kod:</w:t>
+        <w:t xml:space="preserve">Mevcut kod:</w:t>
       </w:r>
     </w:p>
     <w:p>
@@ -15645,6 +17524,292 @@
           <w:szCs w:val="16"/>
         </w:rPr>
         <w:t xml:space="preserve">273| --select 175,stkId,ISNULL(odak.urun_aciklama,'')      &lt;- güncelleme kapatılmış</w:t>
+      </w:r>
+    </w:p>
+    <w:p>
+      <w:pPr>
+        <w:spacing w:after="40" w:before="100"/>
+      </w:pPr>
+      <w:r>
+        <w:rPr>
+          <w:rFonts w:ascii="Calibri" w:cs="Calibri" w:eastAsia="Calibri" w:hAnsi="Calibri"/>
+          <w:b/>
+          <w:bCs/>
+          <w:color w:val="1E7B34"/>
+          <w:sz w:val="17"/>
+          <w:szCs w:val="17"/>
+        </w:rPr>
+        <w:t xml:space="preserve">Önerilen düzeltme (S-6a):</w:t>
+      </w:r>
+    </w:p>
+    <w:p>
+      <w:pPr>
+        <w:spacing w:after="40"/>
+      </w:pPr>
+      <w:r>
+        <w:rPr>
+          <w:rFonts w:ascii="Calibri" w:cs="Calibri" w:eastAsia="Calibri" w:hAnsi="Calibri"/>
+          <w:i/>
+          <w:iCs/>
+          <w:color w:val="555555"/>
+          <w:sz w:val="17"/>
+          <w:szCs w:val="17"/>
+        </w:rPr>
+        <w:t xml:space="preserve">Etki(ölçüldü): 102 Boy → 5.392 · 177 Alt başlık → 1.297 satır. (Bulgudaki 4.578'in kalanı ODAK'ta 'None' yazan boş alt başlık; onlar bilerek dışarıda.)</w:t>
+      </w:r>
+    </w:p>
+    <w:p>
+      <w:pPr>
+        <w:shd w:fill="F4F4F4" w:color="auto" w:val="clear"/>
+        <w:spacing w:after="0"/>
+      </w:pPr>
+      <w:r>
+        <w:rPr>
+          <w:rFonts w:ascii="Consolas" w:cs="Consolas" w:eastAsia="Consolas" w:hAnsi="Consolas"/>
+          <w:sz w:val="16"/>
+          <w:szCs w:val="16"/>
+        </w:rPr>
+        <w:t xml:space="preserve">UPDATE ub SET ub.bDeger = CONVERT(varchar(20), odak.boy)</w:t>
+      </w:r>
+    </w:p>
+    <w:p>
+      <w:pPr>
+        <w:shd w:fill="F4F4F4" w:color="auto" w:val="clear"/>
+        <w:spacing w:after="0"/>
+      </w:pPr>
+      <w:r>
+        <w:rPr>
+          <w:rFonts w:ascii="Consolas" w:cs="Consolas" w:eastAsia="Consolas" w:hAnsi="Consolas"/>
+          <w:sz w:val="16"/>
+          <w:szCs w:val="16"/>
+        </w:rPr>
+        <w:t xml:space="preserve">FROM urn WITH (NOLOCK)</w:t>
+      </w:r>
+    </w:p>
+    <w:p>
+      <w:pPr>
+        <w:shd w:fill="F4F4F4" w:color="auto" w:val="clear"/>
+        <w:spacing w:after="0"/>
+      </w:pPr>
+      <w:r>
+        <w:rPr>
+          <w:rFonts w:ascii="Consolas" w:cs="Consolas" w:eastAsia="Consolas" w:hAnsi="Consolas"/>
+          <w:sz w:val="16"/>
+          <w:szCs w:val="16"/>
+        </w:rPr>
+        <w:t xml:space="preserve">JOIN urnBrkd AS bar                       WITH (NOLOCK) ON bar.urnBrkdStkID = urn.stkID</w:t>
+      </w:r>
+    </w:p>
+    <w:p>
+      <w:pPr>
+        <w:shd w:fill="F4F4F4" w:color="auto" w:val="clear"/>
+        <w:spacing w:after="0"/>
+      </w:pPr>
+      <w:r>
+        <w:rPr>
+          <w:rFonts w:ascii="Consolas" w:cs="Consolas" w:eastAsia="Consolas" w:hAnsi="Consolas"/>
+          <w:sz w:val="16"/>
+          <w:szCs w:val="16"/>
+        </w:rPr>
+        <w:t xml:space="preserve">INNER JOIN BKMDATA.ent.odak_urun_tam odak WITH (NOLOCK) ON odak.barkod = bar.urnBarkod</w:t>
+      </w:r>
+    </w:p>
+    <w:p>
+      <w:pPr>
+        <w:shd w:fill="F4F4F4" w:color="auto" w:val="clear"/>
+        <w:spacing w:after="0"/>
+      </w:pPr>
+      <w:r>
+        <w:rPr>
+          <w:rFonts w:ascii="Consolas" w:cs="Consolas" w:eastAsia="Consolas" w:hAnsi="Consolas"/>
+          <w:sz w:val="16"/>
+          <w:szCs w:val="16"/>
+        </w:rPr>
+        <w:t xml:space="preserve">INNER JOIN urnBilgi AS ub                 WITH (ROWLOCK) ON ub.bVeriID = urn.stkID AND ub.bBilgiID = 102</w:t>
+      </w:r>
+    </w:p>
+    <w:p>
+      <w:pPr>
+        <w:shd w:fill="F4F4F4" w:color="auto" w:val="clear"/>
+        <w:spacing w:after="0"/>
+      </w:pPr>
+      <w:r>
+        <w:rPr>
+          <w:rFonts w:ascii="Consolas" w:cs="Consolas" w:eastAsia="Consolas" w:hAnsi="Consolas"/>
+          <w:sz w:val="16"/>
+          <w:szCs w:val="16"/>
+        </w:rPr>
+        <w:t xml:space="preserve">WHERE odak.SilinecekUrun = 0</w:t>
+      </w:r>
+    </w:p>
+    <w:p>
+      <w:pPr>
+        <w:shd w:fill="F4F4F4" w:color="auto" w:val="clear"/>
+        <w:spacing w:after="0"/>
+      </w:pPr>
+      <w:r>
+        <w:rPr>
+          <w:rFonts w:ascii="Consolas" w:cs="Consolas" w:eastAsia="Consolas" w:hAnsi="Consolas"/>
+          <w:sz w:val="16"/>
+          <w:szCs w:val="16"/>
+        </w:rPr>
+        <w:t xml:space="preserve">  AND ISNULL(TRY_CONVERT(decimal(9,2), ub.bDeger), -1) &lt;&gt; odak.boy        -- sayısal kıyas: '13.0' = '13.00'</w:t>
+      </w:r>
+    </w:p>
+    <w:p>
+      <w:pPr>
+        <w:shd w:fill="F4F4F4" w:color="auto" w:val="clear"/>
+        <w:spacing w:after="0"/>
+      </w:pPr>
+      <w:r>
+        <w:rPr>
+          <w:rFonts w:ascii="Consolas" w:cs="Consolas" w:eastAsia="Consolas" w:hAnsi="Consolas"/>
+          <w:sz w:val="16"/>
+          <w:szCs w:val="16"/>
+        </w:rPr>
+        <w:t xml:space="preserve">  AND urn.stkID NOT IN (SELECT urnBrkdStkID FROM bkm.CiftUrunlerMaxFyat);</w:t>
+      </w:r>
+    </w:p>
+    <w:p>
+      <w:pPr>
+        <w:spacing w:after="40" w:before="100"/>
+      </w:pPr>
+      <w:r>
+        <w:rPr>
+          <w:rFonts w:ascii="Calibri" w:cs="Calibri" w:eastAsia="Calibri" w:hAnsi="Calibri"/>
+          <w:b/>
+          <w:bCs/>
+          <w:color w:val="1E7B34"/>
+          <w:sz w:val="17"/>
+          <w:szCs w:val="17"/>
+        </w:rPr>
+        <w:t xml:space="preserve">Önerilen düzeltme (S-6b):</w:t>
+      </w:r>
+    </w:p>
+    <w:p>
+      <w:pPr>
+        <w:shd w:fill="F4F4F4" w:color="auto" w:val="clear"/>
+        <w:spacing w:after="0"/>
+      </w:pPr>
+      <w:r>
+        <w:rPr>
+          <w:rFonts w:ascii="Consolas" w:cs="Consolas" w:eastAsia="Consolas" w:hAnsi="Consolas"/>
+          <w:sz w:val="16"/>
+          <w:szCs w:val="16"/>
+        </w:rPr>
+        <w:t xml:space="preserve">UPDATE ub SET ub.bDeger = ISNULL(odak.urun_alt_baslik,'')</w:t>
+      </w:r>
+    </w:p>
+    <w:p>
+      <w:pPr>
+        <w:shd w:fill="F4F4F4" w:color="auto" w:val="clear"/>
+        <w:spacing w:after="0"/>
+      </w:pPr>
+      <w:r>
+        <w:rPr>
+          <w:rFonts w:ascii="Consolas" w:cs="Consolas" w:eastAsia="Consolas" w:hAnsi="Consolas"/>
+          <w:sz w:val="16"/>
+          <w:szCs w:val="16"/>
+        </w:rPr>
+        <w:t xml:space="preserve">FROM urn WITH (NOLOCK)</w:t>
+      </w:r>
+    </w:p>
+    <w:p>
+      <w:pPr>
+        <w:shd w:fill="F4F4F4" w:color="auto" w:val="clear"/>
+        <w:spacing w:after="0"/>
+      </w:pPr>
+      <w:r>
+        <w:rPr>
+          <w:rFonts w:ascii="Consolas" w:cs="Consolas" w:eastAsia="Consolas" w:hAnsi="Consolas"/>
+          <w:sz w:val="16"/>
+          <w:szCs w:val="16"/>
+        </w:rPr>
+        <w:t xml:space="preserve">JOIN urnBrkd AS bar                       WITH (NOLOCK) ON bar.urnBrkdStkID = urn.stkID</w:t>
+      </w:r>
+    </w:p>
+    <w:p>
+      <w:pPr>
+        <w:shd w:fill="F4F4F4" w:color="auto" w:val="clear"/>
+        <w:spacing w:after="0"/>
+      </w:pPr>
+      <w:r>
+        <w:rPr>
+          <w:rFonts w:ascii="Consolas" w:cs="Consolas" w:eastAsia="Consolas" w:hAnsi="Consolas"/>
+          <w:sz w:val="16"/>
+          <w:szCs w:val="16"/>
+        </w:rPr>
+        <w:t xml:space="preserve">INNER JOIN BKMDATA.ent.odak_urun_tam odak WITH (NOLOCK) ON odak.barkod = bar.urnBarkod</w:t>
+      </w:r>
+    </w:p>
+    <w:p>
+      <w:pPr>
+        <w:shd w:fill="F4F4F4" w:color="auto" w:val="clear"/>
+        <w:spacing w:after="0"/>
+      </w:pPr>
+      <w:r>
+        <w:rPr>
+          <w:rFonts w:ascii="Consolas" w:cs="Consolas" w:eastAsia="Consolas" w:hAnsi="Consolas"/>
+          <w:sz w:val="16"/>
+          <w:szCs w:val="16"/>
+        </w:rPr>
+        <w:t xml:space="preserve">INNER JOIN urnBilgi AS ub                 WITH (ROWLOCK) ON ub.bVeriID = urn.stkID AND ub.bBilgiID = 177</w:t>
+      </w:r>
+    </w:p>
+    <w:p>
+      <w:pPr>
+        <w:shd w:fill="F4F4F4" w:color="auto" w:val="clear"/>
+        <w:spacing w:after="0"/>
+      </w:pPr>
+      <w:r>
+        <w:rPr>
+          <w:rFonts w:ascii="Consolas" w:cs="Consolas" w:eastAsia="Consolas" w:hAnsi="Consolas"/>
+          <w:sz w:val="16"/>
+          <w:szCs w:val="16"/>
+        </w:rPr>
+        <w:t xml:space="preserve">WHERE odak.SilinecekUrun = 0</w:t>
+      </w:r>
+    </w:p>
+    <w:p>
+      <w:pPr>
+        <w:shd w:fill="F4F4F4" w:color="auto" w:val="clear"/>
+        <w:spacing w:after="0"/>
+      </w:pPr>
+      <w:r>
+        <w:rPr>
+          <w:rFonts w:ascii="Consolas" w:cs="Consolas" w:eastAsia="Consolas" w:hAnsi="Consolas"/>
+          <w:sz w:val="16"/>
+          <w:szCs w:val="16"/>
+        </w:rPr>
+        <w:t xml:space="preserve">  AND ISNULL(odak.urun_alt_baslik,'') &lt;&gt; 'None'</w:t>
+      </w:r>
+    </w:p>
+    <w:p>
+      <w:pPr>
+        <w:shd w:fill="F4F4F4" w:color="auto" w:val="clear"/>
+        <w:spacing w:after="0"/>
+      </w:pPr>
+      <w:r>
+        <w:rPr>
+          <w:rFonts w:ascii="Consolas" w:cs="Consolas" w:eastAsia="Consolas" w:hAnsi="Consolas"/>
+          <w:sz w:val="16"/>
+          <w:szCs w:val="16"/>
+        </w:rPr>
+        <w:t xml:space="preserve">  AND ub.bDeger &lt;&gt; ISNULL(odak.urun_alt_baslik,'')</w:t>
+      </w:r>
+    </w:p>
+    <w:p>
+      <w:pPr>
+        <w:shd w:fill="F4F4F4" w:color="auto" w:val="clear"/>
+        <w:spacing w:after="0"/>
+      </w:pPr>
+      <w:r>
+        <w:rPr>
+          <w:rFonts w:ascii="Consolas" w:cs="Consolas" w:eastAsia="Consolas" w:hAnsi="Consolas"/>
+          <w:sz w:val="16"/>
+          <w:szCs w:val="16"/>
+        </w:rPr>
+        <w:t xml:space="preserve">  AND urn.stkID NOT IN (SELECT urnBrkdStkID FROM bkm.CiftUrunlerMaxFyat);</w:t>
       </w:r>
     </w:p>
     <w:p>
@@ -16069,7 +18234,7 @@
           <w:sz w:val="17"/>
           <w:szCs w:val="17"/>
         </w:rPr>
-        <w:t xml:space="preserve">Kod:</w:t>
+        <w:t xml:space="preserve">Mevcut kod:</w:t>
       </w:r>
     </w:p>
     <w:p>
@@ -16126,6 +18291,164 @@
           <w:szCs w:val="16"/>
         </w:rPr>
         <w:t xml:space="preserve">21| (bar.urnBrkdStkID IS NULL OR u.kod1ID IN(0,2)) and o.satis_durum = 1</w:t>
+      </w:r>
+    </w:p>
+    <w:p>
+      <w:pPr>
+        <w:spacing w:after="40" w:before="100"/>
+      </w:pPr>
+      <w:r>
+        <w:rPr>
+          <w:rFonts w:ascii="Calibri" w:cs="Calibri" w:eastAsia="Calibri" w:hAnsi="Calibri"/>
+          <w:b/>
+          <w:bCs/>
+          <w:color w:val="1E7B34"/>
+          <w:sz w:val="17"/>
+          <w:szCs w:val="17"/>
+        </w:rPr>
+        <w:t xml:space="preserve">Önerilen düzeltme:</w:t>
+      </w:r>
+    </w:p>
+    <w:p>
+      <w:pPr>
+        <w:spacing w:after="40"/>
+      </w:pPr>
+      <w:r>
+        <w:rPr>
+          <w:rFonts w:ascii="Calibri" w:cs="Calibri" w:eastAsia="Calibri" w:hAnsi="Calibri"/>
+          <w:i/>
+          <w:iCs/>
+          <w:color w:val="555555"/>
+          <w:sz w:val="17"/>
+          <w:szCs w:val="17"/>
+        </w:rPr>
+        <w:t xml:space="preserve">Etki(ölçüldü): şu an kapalı ama aktif 130 ürün. Düzeltme sonrası satır 11 bunları pasif yapar ve bir daha aktiflenmez.</w:t>
+      </w:r>
+    </w:p>
+    <w:p>
+      <w:pPr>
+        <w:shd w:fill="F4F4F4" w:color="auto" w:val="clear"/>
+        <w:spacing w:after="0"/>
+      </w:pPr>
+      <w:r>
+        <w:rPr>
+          <w:rFonts w:ascii="Consolas" w:cs="Consolas" w:eastAsia="Consolas" w:hAnsi="Consolas"/>
+          <w:sz w:val="16"/>
+          <w:szCs w:val="16"/>
+        </w:rPr>
+        <w:t xml:space="preserve">UPDATE u SET u.kod1ID = 1</w:t>
+      </w:r>
+    </w:p>
+    <w:p>
+      <w:pPr>
+        <w:shd w:fill="F4F4F4" w:color="auto" w:val="clear"/>
+        <w:spacing w:after="0"/>
+      </w:pPr>
+      <w:r>
+        <w:rPr>
+          <w:rFonts w:ascii="Consolas" w:cs="Consolas" w:eastAsia="Consolas" w:hAnsi="Consolas"/>
+          <w:sz w:val="16"/>
+          <w:szCs w:val="16"/>
+        </w:rPr>
+        <w:t xml:space="preserve">FROM BKMDATA.ent.odak_urun_tam o WITH (NOLOCK)</w:t>
+      </w:r>
+    </w:p>
+    <w:p>
+      <w:pPr>
+        <w:shd w:fill="F4F4F4" w:color="auto" w:val="clear"/>
+        <w:spacing w:after="0"/>
+      </w:pPr>
+      <w:r>
+        <w:rPr>
+          <w:rFonts w:ascii="Consolas" w:cs="Consolas" w:eastAsia="Consolas" w:hAnsi="Consolas"/>
+          <w:sz w:val="16"/>
+          <w:szCs w:val="16"/>
+        </w:rPr>
+        <w:t xml:space="preserve">JOIN dbo.urnBrkd AS bar WITH (NOLOCK) ON bar.urnBarkod = o.barkod</w:t>
+      </w:r>
+    </w:p>
+    <w:p>
+      <w:pPr>
+        <w:shd w:fill="F4F4F4" w:color="auto" w:val="clear"/>
+        <w:spacing w:after="0"/>
+      </w:pPr>
+      <w:r>
+        <w:rPr>
+          <w:rFonts w:ascii="Consolas" w:cs="Consolas" w:eastAsia="Consolas" w:hAnsi="Consolas"/>
+          <w:sz w:val="16"/>
+          <w:szCs w:val="16"/>
+        </w:rPr>
+        <w:t xml:space="preserve">JOIN dbo.urn u                        ON u.stkID = bar.urnBrkdStkID</w:t>
+      </w:r>
+    </w:p>
+    <w:p>
+      <w:pPr>
+        <w:shd w:fill="F4F4F4" w:color="auto" w:val="clear"/>
+        <w:spacing w:after="0"/>
+      </w:pPr>
+      <w:r>
+        <w:rPr>
+          <w:rFonts w:ascii="Consolas" w:cs="Consolas" w:eastAsia="Consolas" w:hAnsi="Consolas"/>
+          <w:sz w:val="16"/>
+          <w:szCs w:val="16"/>
+        </w:rPr>
+        <w:t xml:space="preserve">WHERE u.kod1ID IN (0,2)</w:t>
+      </w:r>
+    </w:p>
+    <w:p>
+      <w:pPr>
+        <w:shd w:fill="F4F4F4" w:color="auto" w:val="clear"/>
+        <w:spacing w:after="0"/>
+      </w:pPr>
+      <w:r>
+        <w:rPr>
+          <w:rFonts w:ascii="Consolas" w:cs="Consolas" w:eastAsia="Consolas" w:hAnsi="Consolas"/>
+          <w:sz w:val="16"/>
+          <w:szCs w:val="16"/>
+        </w:rPr>
+        <w:t xml:space="preserve">  AND o.satis_durum = 1</w:t>
+      </w:r>
+    </w:p>
+    <w:p>
+      <w:pPr>
+        <w:shd w:fill="F4F4F4" w:color="auto" w:val="clear"/>
+        <w:spacing w:after="0"/>
+      </w:pPr>
+      <w:r>
+        <w:rPr>
+          <w:rFonts w:ascii="Consolas" w:cs="Consolas" w:eastAsia="Consolas" w:hAnsi="Consolas"/>
+          <w:sz w:val="16"/>
+          <w:szCs w:val="16"/>
+        </w:rPr>
+        <w:t xml:space="preserve">  AND u.urnDurum = 1;                                                   -- DÜZELTME</w:t>
+      </w:r>
+    </w:p>
+    <w:p>
+      <w:pPr>
+        <w:shd w:fill="F4F4F4" w:color="auto" w:val="clear"/>
+        <w:spacing w:after="0"/>
+      </w:pPr>
+      <w:r>
+        <w:rPr>
+          <w:rFonts w:ascii="Consolas" w:cs="Consolas" w:eastAsia="Consolas" w:hAnsi="Consolas"/>
+          <w:sz w:val="16"/>
+          <w:szCs w:val="16"/>
+        </w:rPr>
+        <w:t xml:space="preserve">-- (eski LEFT JOIN + "bar.urnBrkdStkID IS NULL OR" dalı ERP'de olmayan ürün için hiçbir satırı</w:t>
+      </w:r>
+    </w:p>
+    <w:p>
+      <w:pPr>
+        <w:shd w:fill="F4F4F4" w:color="auto" w:val="clear"/>
+        <w:spacing w:after="0"/>
+      </w:pPr>
+      <w:r>
+        <w:rPr>
+          <w:rFonts w:ascii="Consolas" w:cs="Consolas" w:eastAsia="Consolas" w:hAnsi="Consolas"/>
+          <w:sz w:val="16"/>
+          <w:szCs w:val="16"/>
+        </w:rPr>
+        <w:t xml:space="preserve">--  güncelleyemezdi; INNER JOIN aynı sonucu verir.)</w:t>
       </w:r>
     </w:p>
     <w:p>
@@ -16512,7 +18835,7 @@
           <w:sz w:val="17"/>
           <w:szCs w:val="17"/>
         </w:rPr>
-        <w:t xml:space="preserve">Kod:</w:t>
+        <w:t xml:space="preserve">Mevcut kod:</w:t>
       </w:r>
     </w:p>
     <w:p>
@@ -16541,6 +18864,192 @@
           <w:szCs w:val="16"/>
         </w:rPr>
         <w:t xml:space="preserve">15|  UPDATE u SET u.kod1ID=1 ... u.kod1ID IN(0,2)) and o.satis_durum = 1</w:t>
+      </w:r>
+    </w:p>
+    <w:p>
+      <w:pPr>
+        <w:spacing w:after="40" w:before="100"/>
+      </w:pPr>
+      <w:r>
+        <w:rPr>
+          <w:rFonts w:ascii="Calibri" w:cs="Calibri" w:eastAsia="Calibri" w:hAnsi="Calibri"/>
+          <w:b/>
+          <w:bCs/>
+          <w:color w:val="1E7B34"/>
+          <w:sz w:val="17"/>
+          <w:szCs w:val="17"/>
+        </w:rPr>
+        <w:t xml:space="preserve">Önerilen düzeltme:</w:t>
+      </w:r>
+    </w:p>
+    <w:p>
+      <w:pPr>
+        <w:spacing w:after="40"/>
+      </w:pPr>
+      <w:r>
+        <w:rPr>
+          <w:rFonts w:ascii="Calibri" w:cs="Calibri" w:eastAsia="Calibri" w:hAnsi="Calibri"/>
+          <w:i/>
+          <w:iCs/>
+          <w:color w:val="555555"/>
+          <w:sz w:val="17"/>
+          <w:szCs w:val="17"/>
+        </w:rPr>
+        <w:t xml:space="preserve">Etki(ölçüldü, anlık): eski kural 354 ürünü pasife çekiyor; yeni kural 213. Aradaki 141 ürün satışta ikinci kaydı olduğu için aktif kalır (adım 2 ile çakışma biter).</w:t>
+      </w:r>
+    </w:p>
+    <w:p>
+      <w:pPr>
+        <w:shd w:fill="F4F4F4" w:color="auto" w:val="clear"/>
+        <w:spacing w:after="0"/>
+      </w:pPr>
+      <w:r>
+        <w:rPr>
+          <w:rFonts w:ascii="Consolas" w:cs="Consolas" w:eastAsia="Consolas" w:hAnsi="Consolas"/>
+          <w:sz w:val="16"/>
+          <w:szCs w:val="16"/>
+        </w:rPr>
+        <w:t xml:space="preserve">UPDATE u SET u.kod1ID = 0</w:t>
+      </w:r>
+    </w:p>
+    <w:p>
+      <w:pPr>
+        <w:shd w:fill="F4F4F4" w:color="auto" w:val="clear"/>
+        <w:spacing w:after="0"/>
+      </w:pPr>
+      <w:r>
+        <w:rPr>
+          <w:rFonts w:ascii="Consolas" w:cs="Consolas" w:eastAsia="Consolas" w:hAnsi="Consolas"/>
+          <w:sz w:val="16"/>
+          <w:szCs w:val="16"/>
+        </w:rPr>
+        <w:t xml:space="preserve">FROM BKMDATA.ent.odak_urun_tam d</w:t>
+      </w:r>
+    </w:p>
+    <w:p>
+      <w:pPr>
+        <w:shd w:fill="F4F4F4" w:color="auto" w:val="clear"/>
+        <w:spacing w:after="0"/>
+      </w:pPr>
+      <w:r>
+        <w:rPr>
+          <w:rFonts w:ascii="Consolas" w:cs="Consolas" w:eastAsia="Consolas" w:hAnsi="Consolas"/>
+          <w:sz w:val="16"/>
+          <w:szCs w:val="16"/>
+        </w:rPr>
+        <w:t xml:space="preserve">JOIN urnBrkd AS bar ON bar.urnBarkod = d.barkod</w:t>
+      </w:r>
+    </w:p>
+    <w:p>
+      <w:pPr>
+        <w:shd w:fill="F4F4F4" w:color="auto" w:val="clear"/>
+        <w:spacing w:after="0"/>
+      </w:pPr>
+      <w:r>
+        <w:rPr>
+          <w:rFonts w:ascii="Consolas" w:cs="Consolas" w:eastAsia="Consolas" w:hAnsi="Consolas"/>
+          <w:sz w:val="16"/>
+          <w:szCs w:val="16"/>
+        </w:rPr>
+        <w:t xml:space="preserve">JOIN urn AS u       ON u.stkID = bar.urnBrkdStkID</w:t>
+      </w:r>
+    </w:p>
+    <w:p>
+      <w:pPr>
+        <w:shd w:fill="F4F4F4" w:color="auto" w:val="clear"/>
+        <w:spacing w:after="0"/>
+      </w:pPr>
+      <w:r>
+        <w:rPr>
+          <w:rFonts w:ascii="Consolas" w:cs="Consolas" w:eastAsia="Consolas" w:hAnsi="Consolas"/>
+          <w:sz w:val="16"/>
+          <w:szCs w:val="16"/>
+        </w:rPr>
+        <w:t xml:space="preserve">WHERE u.kod1ID &lt;&gt; 0</w:t>
+      </w:r>
+    </w:p>
+    <w:p>
+      <w:pPr>
+        <w:shd w:fill="F4F4F4" w:color="auto" w:val="clear"/>
+        <w:spacing w:after="0"/>
+      </w:pPr>
+      <w:r>
+        <w:rPr>
+          <w:rFonts w:ascii="Consolas" w:cs="Consolas" w:eastAsia="Consolas" w:hAnsi="Consolas"/>
+          <w:sz w:val="16"/>
+          <w:szCs w:val="16"/>
+        </w:rPr>
+        <w:t xml:space="preserve">  AND (d.SilinecekUrun = 1 OR d.SadeceMagaza = 1)</w:t>
+      </w:r>
+    </w:p>
+    <w:p>
+      <w:pPr>
+        <w:shd w:fill="F4F4F4" w:color="auto" w:val="clear"/>
+        <w:spacing w:after="0"/>
+      </w:pPr>
+      <w:r>
+        <w:rPr>
+          <w:rFonts w:ascii="Consolas" w:cs="Consolas" w:eastAsia="Consolas" w:hAnsi="Consolas"/>
+          <w:sz w:val="16"/>
+          <w:szCs w:val="16"/>
+        </w:rPr>
+        <w:t xml:space="preserve">  AND NOT EXISTS (SELECT 1                                              -- DÜZELTME</w:t>
+      </w:r>
+    </w:p>
+    <w:p>
+      <w:pPr>
+        <w:shd w:fill="F4F4F4" w:color="auto" w:val="clear"/>
+        <w:spacing w:after="0"/>
+      </w:pPr>
+      <w:r>
+        <w:rPr>
+          <w:rFonts w:ascii="Consolas" w:cs="Consolas" w:eastAsia="Consolas" w:hAnsi="Consolas"/>
+          <w:sz w:val="16"/>
+          <w:szCs w:val="16"/>
+        </w:rPr>
+        <w:t xml:space="preserve">                  FROM BKMDATA.ent.odak_urun_tam d2</w:t>
+      </w:r>
+    </w:p>
+    <w:p>
+      <w:pPr>
+        <w:shd w:fill="F4F4F4" w:color="auto" w:val="clear"/>
+        <w:spacing w:after="0"/>
+      </w:pPr>
+      <w:r>
+        <w:rPr>
+          <w:rFonts w:ascii="Consolas" w:cs="Consolas" w:eastAsia="Consolas" w:hAnsi="Consolas"/>
+          <w:sz w:val="16"/>
+          <w:szCs w:val="16"/>
+        </w:rPr>
+        <w:t xml:space="preserve">                  JOIN urnBrkd b2 ON b2.urnBarkod = d2.barkod</w:t>
+      </w:r>
+    </w:p>
+    <w:p>
+      <w:pPr>
+        <w:shd w:fill="F4F4F4" w:color="auto" w:val="clear"/>
+        <w:spacing w:after="0"/>
+      </w:pPr>
+      <w:r>
+        <w:rPr>
+          <w:rFonts w:ascii="Consolas" w:cs="Consolas" w:eastAsia="Consolas" w:hAnsi="Consolas"/>
+          <w:sz w:val="16"/>
+          <w:szCs w:val="16"/>
+        </w:rPr>
+        <w:t xml:space="preserve">                  WHERE b2.urnBrkdStkID = u.stkID</w:t>
+      </w:r>
+    </w:p>
+    <w:p>
+      <w:pPr>
+        <w:shd w:fill="F4F4F4" w:color="auto" w:val="clear"/>
+        <w:spacing w:after="0"/>
+      </w:pPr>
+      <w:r>
+        <w:rPr>
+          <w:rFonts w:ascii="Consolas" w:cs="Consolas" w:eastAsia="Consolas" w:hAnsi="Consolas"/>
+          <w:sz w:val="16"/>
+          <w:szCs w:val="16"/>
+        </w:rPr>
+        <w:t xml:space="preserve">                    AND d2.satis_durum = 1 AND d2.SilinecekUrun = 0 AND d2.SadeceMagaza = 0);</w:t>
       </w:r>
     </w:p>
     <w:p>
@@ -16965,7 +19474,7 @@
           <w:sz w:val="17"/>
           <w:szCs w:val="17"/>
         </w:rPr>
-        <w:t xml:space="preserve">Kod:</w:t>
+        <w:t xml:space="preserve">Mevcut kod:</w:t>
       </w:r>
     </w:p>
     <w:p>
@@ -16994,6 +19503,164 @@
           <w:szCs w:val="16"/>
         </w:rPr>
         <w:t xml:space="preserve">823| AND NOT EXISTS (SELECT COUNT(1) FROM ...urnWeb ff WHERE ... HAVING COUNT(1)&gt;1)</w:t>
+      </w:r>
+    </w:p>
+    <w:p>
+      <w:pPr>
+        <w:spacing w:after="40" w:before="100"/>
+      </w:pPr>
+      <w:r>
+        <w:rPr>
+          <w:rFonts w:ascii="Calibri" w:cs="Calibri" w:eastAsia="Calibri" w:hAnsi="Calibri"/>
+          <w:b/>
+          <w:bCs/>
+          <w:color w:val="1E7B34"/>
+          <w:sz w:val="17"/>
+          <w:szCs w:val="17"/>
+        </w:rPr>
+        <w:t xml:space="preserve">Önerilen düzeltme:</w:t>
+      </w:r>
+    </w:p>
+    <w:p>
+      <w:pPr>
+        <w:spacing w:after="40"/>
+      </w:pPr>
+      <w:r>
+        <w:rPr>
+          <w:rFonts w:ascii="Calibri" w:cs="Calibri" w:eastAsia="Calibri" w:hAnsi="Calibri"/>
+          <w:i/>
+          <w:iCs/>
+          <w:color w:val="555555"/>
+          <w:sz w:val="17"/>
+          <w:szCs w:val="17"/>
+        </w:rPr>
+        <w:t xml:space="preserve">Etki: girdisi saatlik odak_urun_temp olduğu için önceden sayılamaz. Hedef: ürün kodu barkoddan farklı grupta bayat görsel 1.761 (eşit grupta 183).</w:t>
+      </w:r>
+    </w:p>
+    <w:p>
+      <w:pPr>
+        <w:shd w:fill="F4F4F4" w:color="auto" w:val="clear"/>
+        <w:spacing w:after="0"/>
+      </w:pPr>
+      <w:r>
+        <w:rPr>
+          <w:rFonts w:ascii="Consolas" w:cs="Consolas" w:eastAsia="Consolas" w:hAnsi="Consolas"/>
+          <w:sz w:val="16"/>
+          <w:szCs w:val="16"/>
+        </w:rPr>
+        <w:t xml:space="preserve">DELETE res</w:t>
+      </w:r>
+    </w:p>
+    <w:p>
+      <w:pPr>
+        <w:shd w:fill="F4F4F4" w:color="auto" w:val="clear"/>
+        <w:spacing w:after="0"/>
+      </w:pPr>
+      <w:r>
+        <w:rPr>
+          <w:rFonts w:ascii="Consolas" w:cs="Consolas" w:eastAsia="Consolas" w:hAnsi="Consolas"/>
+          <w:sz w:val="16"/>
+          <w:szCs w:val="16"/>
+        </w:rPr>
+        <w:t xml:space="preserve">FROM BKMDATA.ent.odak_urun_temp tmp</w:t>
+      </w:r>
+    </w:p>
+    <w:p>
+      <w:pPr>
+        <w:shd w:fill="F4F4F4" w:color="auto" w:val="clear"/>
+        <w:spacing w:after="0"/>
+      </w:pPr>
+      <w:r>
+        <w:rPr>
+          <w:rFonts w:ascii="Consolas" w:cs="Consolas" w:eastAsia="Consolas" w:hAnsi="Consolas"/>
+          <w:sz w:val="16"/>
+          <w:szCs w:val="16"/>
+        </w:rPr>
+        <w:t xml:space="preserve">JOIN BKMDATA.ent.odak_urun_tam AS odak         ON odak.urun_id = tmp.urun_id</w:t>
+      </w:r>
+    </w:p>
+    <w:p>
+      <w:pPr>
+        <w:shd w:fill="F4F4F4" w:color="auto" w:val="clear"/>
+        <w:spacing w:after="0"/>
+      </w:pPr>
+      <w:r>
+        <w:rPr>
+          <w:rFonts w:ascii="Consolas" w:cs="Consolas" w:eastAsia="Consolas" w:hAnsi="Consolas"/>
+          <w:sz w:val="16"/>
+          <w:szCs w:val="16"/>
+        </w:rPr>
+        <w:t xml:space="preserve">JOIN DerinSISBkm.dbo.urnBrkd bar WITH (NOLOCK)  ON bar.urnBarkod = odak.barkod          -- DÜZELTME</w:t>
+      </w:r>
+    </w:p>
+    <w:p>
+      <w:pPr>
+        <w:shd w:fill="F4F4F4" w:color="auto" w:val="clear"/>
+        <w:spacing w:after="0"/>
+      </w:pPr>
+      <w:r>
+        <w:rPr>
+          <w:rFonts w:ascii="Consolas" w:cs="Consolas" w:eastAsia="Consolas" w:hAnsi="Consolas"/>
+          <w:sz w:val="16"/>
+          <w:szCs w:val="16"/>
+        </w:rPr>
+        <w:t xml:space="preserve">JOIN DerinSISBkm.dbo.urn u WITH (NOLOCK)        ON u.stkID = bar.urnBrkdStkID            -- DÜZELTME (eski: u.stkKod = odak.barkod)</w:t>
+      </w:r>
+    </w:p>
+    <w:p>
+      <w:pPr>
+        <w:shd w:fill="F4F4F4" w:color="auto" w:val="clear"/>
+        <w:spacing w:after="0"/>
+      </w:pPr>
+      <w:r>
+        <w:rPr>
+          <w:rFonts w:ascii="Consolas" w:cs="Consolas" w:eastAsia="Consolas" w:hAnsi="Consolas"/>
+          <w:sz w:val="16"/>
+          <w:szCs w:val="16"/>
+        </w:rPr>
+        <w:t xml:space="preserve">JOIN DerinSISBkm.ent.tsoft_urun AS tsoft        ON tsoft.stkid = u.stkID</w:t>
+      </w:r>
+    </w:p>
+    <w:p>
+      <w:pPr>
+        <w:shd w:fill="F4F4F4" w:color="auto" w:val="clear"/>
+        <w:spacing w:after="0"/>
+      </w:pPr>
+      <w:r>
+        <w:rPr>
+          <w:rFonts w:ascii="Consolas" w:cs="Consolas" w:eastAsia="Consolas" w:hAnsi="Consolas"/>
+          <w:sz w:val="16"/>
+          <w:szCs w:val="16"/>
+        </w:rPr>
+        <w:t xml:space="preserve">JOIN DerinSISBkmWeb.web.urnWeb AS res           ON res.urnWebBilgiID = u.stkID</w:t>
+      </w:r>
+    </w:p>
+    <w:p>
+      <w:pPr>
+        <w:shd w:fill="F4F4F4" w:color="auto" w:val="clear"/>
+        <w:spacing w:after="0"/>
+      </w:pPr>
+      <w:r>
+        <w:rPr>
+          <w:rFonts w:ascii="Consolas" w:cs="Consolas" w:eastAsia="Consolas" w:hAnsi="Consolas"/>
+          <w:sz w:val="16"/>
+          <w:szCs w:val="16"/>
+        </w:rPr>
+        <w:t xml:space="preserve">WHERE odak.gorsel_guncelleme_tarih &lt;&gt; tmp.gorsel_guncelleme_tarih</w:t>
+      </w:r>
+    </w:p>
+    <w:p>
+      <w:pPr>
+        <w:shd w:fill="F4F4F4" w:color="auto" w:val="clear"/>
+        <w:spacing w:after="0"/>
+      </w:pPr>
+      <w:r>
+        <w:rPr>
+          <w:rFonts w:ascii="Consolas" w:cs="Consolas" w:eastAsia="Consolas" w:hAnsi="Consolas"/>
+          <w:sz w:val="16"/>
+          <w:szCs w:val="16"/>
+        </w:rPr>
+        <w:t xml:space="preserve">   OR odak.urun_gorsel_url &lt;&gt; tmp.urun_gorsel_url;</w:t>
       </w:r>
     </w:p>
     <w:p>
@@ -17380,7 +20047,7 @@
           <w:sz w:val="17"/>
           <w:szCs w:val="17"/>
         </w:rPr>
-        <w:t xml:space="preserve">Kod:</w:t>
+        <w:t xml:space="preserve">Mevcut kod:</w:t>
       </w:r>
     </w:p>
     <w:p>
@@ -17395,6 +20062,94 @@
           <w:szCs w:val="16"/>
         </w:rPr>
         <w:t xml:space="preserve">879| UPDATE u SET u.stkAdKisa=SUBSTRING(u.stkAd,0,30) from dbo.urn AS u WHERE u.stkAdKisa&lt;&gt;SUBSTRING(u.stkAd,0,30)</w:t>
+      </w:r>
+    </w:p>
+    <w:p>
+      <w:pPr>
+        <w:spacing w:after="40" w:before="100"/>
+      </w:pPr>
+      <w:r>
+        <w:rPr>
+          <w:rFonts w:ascii="Calibri" w:cs="Calibri" w:eastAsia="Calibri" w:hAnsi="Calibri"/>
+          <w:b/>
+          <w:bCs/>
+          <w:color w:val="1E7B34"/>
+          <w:sz w:val="17"/>
+          <w:szCs w:val="17"/>
+        </w:rPr>
+        <w:t xml:space="preserve">Önerilen düzeltme:</w:t>
+      </w:r>
+    </w:p>
+    <w:p>
+      <w:pPr>
+        <w:spacing w:after="40"/>
+      </w:pPr>
+      <w:r>
+        <w:rPr>
+          <w:rFonts w:ascii="Calibri" w:cs="Calibri" w:eastAsia="Calibri" w:hAnsi="Calibri"/>
+          <w:i/>
+          <w:iCs/>
+          <w:color w:val="555555"/>
+          <w:sz w:val="17"/>
+          <w:szCs w:val="17"/>
+        </w:rPr>
+        <w:t xml:space="preserve">Etki(ölçüldü): kapsam 842.648 → 288.466 ürün (ugKisi=137). İlk koşumda 114.487 kısa ad 29→30 karaktere uzar; ODAK dışı 194.128 ürüne artık dokunulmaz.</w:t>
+      </w:r>
+    </w:p>
+    <w:p>
+      <w:pPr>
+        <w:shd w:fill="F4F4F4" w:color="auto" w:val="clear"/>
+        <w:spacing w:after="0"/>
+      </w:pPr>
+      <w:r>
+        <w:rPr>
+          <w:rFonts w:ascii="Consolas" w:cs="Consolas" w:eastAsia="Consolas" w:hAnsi="Consolas"/>
+          <w:sz w:val="16"/>
+          <w:szCs w:val="16"/>
+        </w:rPr>
+        <w:t xml:space="preserve">UPDATE u SET u.stkAdKisa = SUBSTRING(u.stkAd, 1, 30)</w:t>
+      </w:r>
+    </w:p>
+    <w:p>
+      <w:pPr>
+        <w:shd w:fill="F4F4F4" w:color="auto" w:val="clear"/>
+        <w:spacing w:after="0"/>
+      </w:pPr>
+      <w:r>
+        <w:rPr>
+          <w:rFonts w:ascii="Consolas" w:cs="Consolas" w:eastAsia="Consolas" w:hAnsi="Consolas"/>
+          <w:sz w:val="16"/>
+          <w:szCs w:val="16"/>
+        </w:rPr>
+        <w:t xml:space="preserve">FROM dbo.urn AS u WITH (ROWLOCK)</w:t>
+      </w:r>
+    </w:p>
+    <w:p>
+      <w:pPr>
+        <w:shd w:fill="F4F4F4" w:color="auto" w:val="clear"/>
+        <w:spacing w:after="0"/>
+      </w:pPr>
+      <w:r>
+        <w:rPr>
+          <w:rFonts w:ascii="Consolas" w:cs="Consolas" w:eastAsia="Consolas" w:hAnsi="Consolas"/>
+          <w:sz w:val="16"/>
+          <w:szCs w:val="16"/>
+        </w:rPr>
+        <w:t xml:space="preserve">WHERE u.ugKisi = 137                                                    -- DÜZELTME: yalnız otomatik açılan ürün</w:t>
+      </w:r>
+    </w:p>
+    <w:p>
+      <w:pPr>
+        <w:shd w:fill="F4F4F4" w:color="auto" w:val="clear"/>
+        <w:spacing w:after="0"/>
+      </w:pPr>
+      <w:r>
+        <w:rPr>
+          <w:rFonts w:ascii="Consolas" w:cs="Consolas" w:eastAsia="Consolas" w:hAnsi="Consolas"/>
+          <w:sz w:val="16"/>
+          <w:szCs w:val="16"/>
+        </w:rPr>
+        <w:t xml:space="preserve">  AND u.stkAdKisa &lt;&gt; SUBSTRING(u.stkAd, 1, 30);                         -- DÜZELTME: 0 → 1</w:t>
       </w:r>
     </w:p>
     <w:p>
@@ -17762,7 +20517,7 @@
           <w:sz w:val="17"/>
           <w:szCs w:val="17"/>
         </w:rPr>
-        <w:t xml:space="preserve">Kod:</w:t>
+        <w:t xml:space="preserve">Mevcut kod:</w:t>
       </w:r>
     </w:p>
     <w:p>
@@ -17805,6 +20560,164 @@
           <w:szCs w:val="16"/>
         </w:rPr>
         <w:t xml:space="preserve">151| where u.urnKtgrID not in(43,35) and f.urnFrmDagitici is NULL</w:t>
+      </w:r>
+    </w:p>
+    <w:p>
+      <w:pPr>
+        <w:spacing w:after="40" w:before="100"/>
+      </w:pPr>
+      <w:r>
+        <w:rPr>
+          <w:rFonts w:ascii="Calibri" w:cs="Calibri" w:eastAsia="Calibri" w:hAnsi="Calibri"/>
+          <w:b/>
+          <w:bCs/>
+          <w:color w:val="1E7B34"/>
+          <w:sz w:val="17"/>
+          <w:szCs w:val="17"/>
+        </w:rPr>
+        <w:t xml:space="preserve">Önerilen düzeltme:</w:t>
+      </w:r>
+    </w:p>
+    <w:p>
+      <w:pPr>
+        <w:spacing w:after="40"/>
+      </w:pPr>
+      <w:r>
+        <w:rPr>
+          <w:rFonts w:ascii="Calibri" w:cs="Calibri" w:eastAsia="Calibri" w:hAnsi="Calibri"/>
+          <w:i/>
+          <w:iCs/>
+          <w:color w:val="555555"/>
+          <w:sz w:val="17"/>
+          <w:szCs w:val="17"/>
+        </w:rPr>
+        <w:t xml:space="preserve">Etki(ölçüldü): bugün eklenecek yeni bağ 0 (hepsi zaten bağlı). Değişiklik yalnız İLERİYE dönük: ODAK dışı yeni ürüne bağ eklenmez.</w:t>
+      </w:r>
+    </w:p>
+    <w:p>
+      <w:pPr>
+        <w:shd w:fill="F4F4F4" w:color="auto" w:val="clear"/>
+        <w:spacing w:after="0"/>
+      </w:pPr>
+      <w:r>
+        <w:rPr>
+          <w:rFonts w:ascii="Consolas" w:cs="Consolas" w:eastAsia="Consolas" w:hAnsi="Consolas"/>
+          <w:sz w:val="16"/>
+          <w:szCs w:val="16"/>
+        </w:rPr>
+        <w:t xml:space="preserve">INSERT INTO urnFrm (urnFrmStkID, urnFrmFirmaID, urnFrmEsas, urnFrmEtkin)</w:t>
+      </w:r>
+    </w:p>
+    <w:p>
+      <w:pPr>
+        <w:shd w:fill="F4F4F4" w:color="auto" w:val="clear"/>
+        <w:spacing w:after="0"/>
+      </w:pPr>
+      <w:r>
+        <w:rPr>
+          <w:rFonts w:ascii="Consolas" w:cs="Consolas" w:eastAsia="Consolas" w:hAnsi="Consolas"/>
+          <w:sz w:val="16"/>
+          <w:szCs w:val="16"/>
+        </w:rPr>
+        <w:t xml:space="preserve">SELECT u.stkID, frm.frmID, 1, 1</w:t>
+      </w:r>
+    </w:p>
+    <w:p>
+      <w:pPr>
+        <w:shd w:fill="F4F4F4" w:color="auto" w:val="clear"/>
+        <w:spacing w:after="0"/>
+      </w:pPr>
+      <w:r>
+        <w:rPr>
+          <w:rFonts w:ascii="Consolas" w:cs="Consolas" w:eastAsia="Consolas" w:hAnsi="Consolas"/>
+          <w:sz w:val="16"/>
+          <w:szCs w:val="16"/>
+        </w:rPr>
+        <w:t xml:space="preserve">FROM urn u WITH (NOLOCK)</w:t>
+      </w:r>
+    </w:p>
+    <w:p>
+      <w:pPr>
+        <w:shd w:fill="F4F4F4" w:color="auto" w:val="clear"/>
+        <w:spacing w:after="0"/>
+      </w:pPr>
+      <w:r>
+        <w:rPr>
+          <w:rFonts w:ascii="Consolas" w:cs="Consolas" w:eastAsia="Consolas" w:hAnsi="Consolas"/>
+          <w:sz w:val="16"/>
+          <w:szCs w:val="16"/>
+        </w:rPr>
+        <w:t xml:space="preserve">JOIN frm WITH (NOLOCK) ON frm.frmID IN (56, 9525)</w:t>
+      </w:r>
+    </w:p>
+    <w:p>
+      <w:pPr>
+        <w:shd w:fill="F4F4F4" w:color="auto" w:val="clear"/>
+        <w:spacing w:after="0"/>
+      </w:pPr>
+      <w:r>
+        <w:rPr>
+          <w:rFonts w:ascii="Consolas" w:cs="Consolas" w:eastAsia="Consolas" w:hAnsi="Consolas"/>
+          <w:sz w:val="16"/>
+          <w:szCs w:val="16"/>
+        </w:rPr>
+        <w:t xml:space="preserve">LEFT JOIN urnFrm f WITH (NOLOCK) ON f.urnFrmStkID = u.stkID AND f.urnFrmFirmaID = frm.frmID</w:t>
+      </w:r>
+    </w:p>
+    <w:p>
+      <w:pPr>
+        <w:shd w:fill="F4F4F4" w:color="auto" w:val="clear"/>
+        <w:spacing w:after="0"/>
+      </w:pPr>
+      <w:r>
+        <w:rPr>
+          <w:rFonts w:ascii="Consolas" w:cs="Consolas" w:eastAsia="Consolas" w:hAnsi="Consolas"/>
+          <w:sz w:val="16"/>
+          <w:szCs w:val="16"/>
+        </w:rPr>
+        <w:t xml:space="preserve">WHERE u.urnKtgrID NOT IN (43, 35)</w:t>
+      </w:r>
+    </w:p>
+    <w:p>
+      <w:pPr>
+        <w:shd w:fill="F4F4F4" w:color="auto" w:val="clear"/>
+        <w:spacing w:after="0"/>
+      </w:pPr>
+      <w:r>
+        <w:rPr>
+          <w:rFonts w:ascii="Consolas" w:cs="Consolas" w:eastAsia="Consolas" w:hAnsi="Consolas"/>
+          <w:sz w:val="16"/>
+          <w:szCs w:val="16"/>
+        </w:rPr>
+        <w:t xml:space="preserve">  AND f.urnFrmStkID IS NULL</w:t>
+      </w:r>
+    </w:p>
+    <w:p>
+      <w:pPr>
+        <w:shd w:fill="F4F4F4" w:color="auto" w:val="clear"/>
+        <w:spacing w:after="0"/>
+      </w:pPr>
+      <w:r>
+        <w:rPr>
+          <w:rFonts w:ascii="Consolas" w:cs="Consolas" w:eastAsia="Consolas" w:hAnsi="Consolas"/>
+          <w:sz w:val="16"/>
+          <w:szCs w:val="16"/>
+        </w:rPr>
+        <w:t xml:space="preserve">  AND EXISTS (SELECT 1 FROM urnBrkd b JOIN BKMDATA.ent.odak_urun_tam o ON o.barkod = b.urnBarkod</w:t>
+      </w:r>
+    </w:p>
+    <w:p>
+      <w:pPr>
+        <w:shd w:fill="F4F4F4" w:color="auto" w:val="clear"/>
+        <w:spacing w:after="0"/>
+      </w:pPr>
+      <w:r>
+        <w:rPr>
+          <w:rFonts w:ascii="Consolas" w:cs="Consolas" w:eastAsia="Consolas" w:hAnsi="Consolas"/>
+          <w:sz w:val="16"/>
+          <w:szCs w:val="16"/>
+        </w:rPr>
+        <w:t xml:space="preserve">              WHERE b.urnBrkdStkID = u.stkID);                          -- DÜZELTME: yalnız ODAK ürünü</w:t>
       </w:r>
     </w:p>
     <w:p>
@@ -18229,7 +21142,7 @@
           <w:sz w:val="17"/>
           <w:szCs w:val="17"/>
         </w:rPr>
-        <w:t xml:space="preserve">Kod:</w:t>
+        <w:t xml:space="preserve">Mevcut kod:</w:t>
       </w:r>
     </w:p>
     <w:p>
@@ -18272,6 +21185,122 @@
           <w:szCs w:val="16"/>
         </w:rPr>
         <w:t xml:space="preserve">181| where f.urnFrmFirmaID&lt;&gt;u.stkFirma</w:t>
+      </w:r>
+    </w:p>
+    <w:p>
+      <w:pPr>
+        <w:spacing w:after="40" w:before="100"/>
+      </w:pPr>
+      <w:r>
+        <w:rPr>
+          <w:rFonts w:ascii="Calibri" w:cs="Calibri" w:eastAsia="Calibri" w:hAnsi="Calibri"/>
+          <w:b/>
+          <w:bCs/>
+          <w:color w:val="1E7B34"/>
+          <w:sz w:val="17"/>
+          <w:szCs w:val="17"/>
+        </w:rPr>
+        <w:t xml:space="preserve">Önerilen düzeltme:</w:t>
+      </w:r>
+    </w:p>
+    <w:p>
+      <w:pPr>
+        <w:spacing w:after="40"/>
+      </w:pPr>
+      <w:r>
+        <w:rPr>
+          <w:rFonts w:ascii="Calibri" w:cs="Calibri" w:eastAsia="Calibri" w:hAnsi="Calibri"/>
+          <w:i/>
+          <w:iCs/>
+          <w:color w:val="555555"/>
+          <w:sz w:val="17"/>
+          <w:szCs w:val="17"/>
+        </w:rPr>
+        <w:t xml:space="preserve">Etki(ölçüldü): ilk koşumda 12.778 ürünün ana tedarikçisi değişir; sonra 25.480 ürünlük saatlik yeniden yazma biter.</w:t>
+      </w:r>
+    </w:p>
+    <w:p>
+      <w:pPr>
+        <w:shd w:fill="F4F4F4" w:color="auto" w:val="clear"/>
+        <w:spacing w:after="0"/>
+      </w:pPr>
+      <w:r>
+        <w:rPr>
+          <w:rFonts w:ascii="Consolas" w:cs="Consolas" w:eastAsia="Consolas" w:hAnsi="Consolas"/>
+          <w:sz w:val="16"/>
+          <w:szCs w:val="16"/>
+        </w:rPr>
+        <w:t xml:space="preserve">UPDATE u SET u.stkFirma = f.firma</w:t>
+      </w:r>
+    </w:p>
+    <w:p>
+      <w:pPr>
+        <w:shd w:fill="F4F4F4" w:color="auto" w:val="clear"/>
+        <w:spacing w:after="0"/>
+      </w:pPr>
+      <w:r>
+        <w:rPr>
+          <w:rFonts w:ascii="Consolas" w:cs="Consolas" w:eastAsia="Consolas" w:hAnsi="Consolas"/>
+          <w:sz w:val="16"/>
+          <w:szCs w:val="16"/>
+        </w:rPr>
+        <w:t xml:space="preserve">FROM urn u WITH (ROWLOCK)</w:t>
+      </w:r>
+    </w:p>
+    <w:p>
+      <w:pPr>
+        <w:shd w:fill="F4F4F4" w:color="auto" w:val="clear"/>
+        <w:spacing w:after="0"/>
+      </w:pPr>
+      <w:r>
+        <w:rPr>
+          <w:rFonts w:ascii="Consolas" w:cs="Consolas" w:eastAsia="Consolas" w:hAnsi="Consolas"/>
+          <w:sz w:val="16"/>
+          <w:szCs w:val="16"/>
+        </w:rPr>
+        <w:t xml:space="preserve">JOIN (SELECT urnFrmStkID, MIN(urnFrmFirmaID) firma</w:t>
+      </w:r>
+    </w:p>
+    <w:p>
+      <w:pPr>
+        <w:shd w:fill="F4F4F4" w:color="auto" w:val="clear"/>
+        <w:spacing w:after="0"/>
+      </w:pPr>
+      <w:r>
+        <w:rPr>
+          <w:rFonts w:ascii="Consolas" w:cs="Consolas" w:eastAsia="Consolas" w:hAnsi="Consolas"/>
+          <w:sz w:val="16"/>
+          <w:szCs w:val="16"/>
+        </w:rPr>
+        <w:t xml:space="preserve">      FROM urnFrm WITH (NOLOCK) WHERE urnFrmEsas = 0</w:t>
+      </w:r>
+    </w:p>
+    <w:p>
+      <w:pPr>
+        <w:shd w:fill="F4F4F4" w:color="auto" w:val="clear"/>
+        <w:spacing w:after="0"/>
+      </w:pPr>
+      <w:r>
+        <w:rPr>
+          <w:rFonts w:ascii="Consolas" w:cs="Consolas" w:eastAsia="Consolas" w:hAnsi="Consolas"/>
+          <w:sz w:val="16"/>
+          <w:szCs w:val="16"/>
+        </w:rPr>
+        <w:t xml:space="preserve">      GROUP BY urnFrmStkID) f ON f.urnFrmStkID = u.stkID                -- DÜZELTME: tek, belirli seçim</w:t>
+      </w:r>
+    </w:p>
+    <w:p>
+      <w:pPr>
+        <w:shd w:fill="F4F4F4" w:color="auto" w:val="clear"/>
+        <w:spacing w:after="0"/>
+      </w:pPr>
+      <w:r>
+        <w:rPr>
+          <w:rFonts w:ascii="Consolas" w:cs="Consolas" w:eastAsia="Consolas" w:hAnsi="Consolas"/>
+          <w:sz w:val="16"/>
+          <w:szCs w:val="16"/>
+        </w:rPr>
+        <w:t xml:space="preserve">WHERE f.firma &lt;&gt; u.stkFirma;</w:t>
       </w:r>
     </w:p>
     <w:p>
@@ -18724,7 +21753,7 @@
           <w:sz w:val="17"/>
           <w:szCs w:val="17"/>
         </w:rPr>
-        <w:t xml:space="preserve">Kod:</w:t>
+        <w:t xml:space="preserve">Mevcut kod:</w:t>
       </w:r>
     </w:p>
     <w:p>
@@ -18739,6 +21768,122 @@
           <w:szCs w:val="16"/>
         </w:rPr>
         <w:t xml:space="preserve">16| INSERT INTO ent.odak_urun_log (urun_id,satis_durum,etiket_fiyat,LogTarih)   &lt;- Tip yok</w:t>
+      </w:r>
+    </w:p>
+    <w:p>
+      <w:pPr>
+        <w:spacing w:after="40" w:before="100"/>
+      </w:pPr>
+      <w:r>
+        <w:rPr>
+          <w:rFonts w:ascii="Calibri" w:cs="Calibri" w:eastAsia="Calibri" w:hAnsi="Calibri"/>
+          <w:b/>
+          <w:bCs/>
+          <w:color w:val="1E7B34"/>
+          <w:sz w:val="17"/>
+          <w:szCs w:val="17"/>
+        </w:rPr>
+        <w:t xml:space="preserve">Önerilen düzeltme:</w:t>
+      </w:r>
+    </w:p>
+    <w:p>
+      <w:pPr>
+        <w:spacing w:after="40"/>
+      </w:pPr>
+      <w:r>
+        <w:rPr>
+          <w:rFonts w:ascii="Calibri" w:cs="Calibri" w:eastAsia="Calibri" w:hAnsi="Calibri"/>
+          <w:i/>
+          <w:iCs/>
+          <w:color w:val="555555"/>
+          <w:sz w:val="17"/>
+          <w:szCs w:val="17"/>
+        </w:rPr>
+        <w:t xml:space="preserve">Etki: girdisi saatlik magaza_temp; önceden sayılamaz. Bundan sonraki mağaza değişimleri Tip=1 ile ayrılır, geçmiş kayıtlar düzelmez.</w:t>
+      </w:r>
+    </w:p>
+    <w:p>
+      <w:pPr>
+        <w:shd w:fill="F4F4F4" w:color="auto" w:val="clear"/>
+        <w:spacing w:after="0"/>
+      </w:pPr>
+      <w:r>
+        <w:rPr>
+          <w:rFonts w:ascii="Consolas" w:cs="Consolas" w:eastAsia="Consolas" w:hAnsi="Consolas"/>
+          <w:sz w:val="16"/>
+          <w:szCs w:val="16"/>
+        </w:rPr>
+        <w:t xml:space="preserve">INSERT INTO BKMDATA.ent.odak_urun_log (urun_id, satis_durum, etiket_fiyat, LogTarih, Tip)   -- DÜZELTME: Tip</w:t>
+      </w:r>
+    </w:p>
+    <w:p>
+      <w:pPr>
+        <w:shd w:fill="F4F4F4" w:color="auto" w:val="clear"/>
+        <w:spacing w:after="0"/>
+      </w:pPr>
+      <w:r>
+        <w:rPr>
+          <w:rFonts w:ascii="Consolas" w:cs="Consolas" w:eastAsia="Consolas" w:hAnsi="Consolas"/>
+          <w:sz w:val="16"/>
+          <w:szCs w:val="16"/>
+        </w:rPr>
+        <w:t xml:space="preserve">SELECT DISTINCT tmp.urun_id, tmp.satis_durum, tmp.etiket_fiyat, GETDATE(), 1                 -- DÜZELTME: 1 = mağaza</w:t>
+      </w:r>
+    </w:p>
+    <w:p>
+      <w:pPr>
+        <w:shd w:fill="F4F4F4" w:color="auto" w:val="clear"/>
+        <w:spacing w:after="0"/>
+      </w:pPr>
+      <w:r>
+        <w:rPr>
+          <w:rFonts w:ascii="Consolas" w:cs="Consolas" w:eastAsia="Consolas" w:hAnsi="Consolas"/>
+          <w:sz w:val="16"/>
+          <w:szCs w:val="16"/>
+        </w:rPr>
+        <w:t xml:space="preserve">FROM BKMDATA.ent.odak_urun_magaza_temp tmp</w:t>
+      </w:r>
+    </w:p>
+    <w:p>
+      <w:pPr>
+        <w:shd w:fill="F4F4F4" w:color="auto" w:val="clear"/>
+        <w:spacing w:after="0"/>
+      </w:pPr>
+      <w:r>
+        <w:rPr>
+          <w:rFonts w:ascii="Consolas" w:cs="Consolas" w:eastAsia="Consolas" w:hAnsi="Consolas"/>
+          <w:sz w:val="16"/>
+          <w:szCs w:val="16"/>
+        </w:rPr>
+        <w:t xml:space="preserve">JOIN BKMDATA.ent.odak_urun_magaza_tam AS tam ON tam.urun_id = tmp.urun_id</w:t>
+      </w:r>
+    </w:p>
+    <w:p>
+      <w:pPr>
+        <w:shd w:fill="F4F4F4" w:color="auto" w:val="clear"/>
+        <w:spacing w:after="0"/>
+      </w:pPr>
+      <w:r>
+        <w:rPr>
+          <w:rFonts w:ascii="Consolas" w:cs="Consolas" w:eastAsia="Consolas" w:hAnsi="Consolas"/>
+          <w:sz w:val="16"/>
+          <w:szCs w:val="16"/>
+        </w:rPr>
+        <w:t xml:space="preserve">WHERE tam.etiket_fiyat &lt;&gt; tmp.etiket_fiyat</w:t>
+      </w:r>
+    </w:p>
+    <w:p>
+      <w:pPr>
+        <w:shd w:fill="F4F4F4" w:color="auto" w:val="clear"/>
+        <w:spacing w:after="0"/>
+      </w:pPr>
+      <w:r>
+        <w:rPr>
+          <w:rFonts w:ascii="Consolas" w:cs="Consolas" w:eastAsia="Consolas" w:hAnsi="Consolas"/>
+          <w:sz w:val="16"/>
+          <w:szCs w:val="16"/>
+        </w:rPr>
+        <w:t xml:space="preserve">   OR tam.satis_durum  &lt;&gt; tmp.satis_durum;</w:t>
       </w:r>
     </w:p>
     <w:p>
@@ -19106,7 +22251,7 @@
           <w:sz w:val="17"/>
           <w:szCs w:val="17"/>
         </w:rPr>
-        <w:t xml:space="preserve">Kod:</w:t>
+        <w:t xml:space="preserve">Mevcut kod:</w:t>
       </w:r>
     </w:p>
     <w:p>
@@ -19121,6 +22266,66 @@
           <w:szCs w:val="16"/>
         </w:rPr>
         <w:t xml:space="preserve">58| INSERT INTO OdakStokDegisenStok_Log (ProductCode, StokMiktar, InsertDate) ...</w:t>
+      </w:r>
+    </w:p>
+    <w:p>
+      <w:pPr>
+        <w:spacing w:after="40" w:before="100"/>
+      </w:pPr>
+      <w:r>
+        <w:rPr>
+          <w:rFonts w:ascii="Calibri" w:cs="Calibri" w:eastAsia="Calibri" w:hAnsi="Calibri"/>
+          <w:b/>
+          <w:bCs/>
+          <w:color w:val="1E7B34"/>
+          <w:sz w:val="17"/>
+          <w:szCs w:val="17"/>
+        </w:rPr>
+        <w:t xml:space="preserve">Önerilen düzeltme:</w:t>
+      </w:r>
+    </w:p>
+    <w:p>
+      <w:pPr>
+        <w:spacing w:after="40"/>
+      </w:pPr>
+      <w:r>
+        <w:rPr>
+          <w:rFonts w:ascii="Calibri" w:cs="Calibri" w:eastAsia="Calibri" w:hAnsi="Calibri"/>
+          <w:i/>
+          <w:iCs/>
+          <w:color w:val="555555"/>
+          <w:sz w:val="17"/>
+          <w:szCs w:val="17"/>
+        </w:rPr>
+        <w:t xml:space="preserve">Etki(ölçüldü): 90 günden eski 86.018.556 satır. Koşum başı 50 bin ile ~1.720 koşum (5 dk'da bir ≈ 6 gün) sonra kararlı hâle gelir.</w:t>
+      </w:r>
+    </w:p>
+    <w:p>
+      <w:pPr>
+        <w:shd w:fill="F4F4F4" w:color="auto" w:val="clear"/>
+        <w:spacing w:after="0"/>
+      </w:pPr>
+      <w:r>
+        <w:rPr>
+          <w:rFonts w:ascii="Consolas" w:cs="Consolas" w:eastAsia="Consolas" w:hAnsi="Consolas"/>
+          <w:sz w:val="16"/>
+          <w:szCs w:val="16"/>
+        </w:rPr>
+        <w:t xml:space="preserve">DELETE TOP (50000) FROM BKMDATA.dbo.OdakStokDegisenStok_Log</w:t>
+      </w:r>
+    </w:p>
+    <w:p>
+      <w:pPr>
+        <w:shd w:fill="F4F4F4" w:color="auto" w:val="clear"/>
+        <w:spacing w:after="0"/>
+      </w:pPr>
+      <w:r>
+        <w:rPr>
+          <w:rFonts w:ascii="Consolas" w:cs="Consolas" w:eastAsia="Consolas" w:hAnsi="Consolas"/>
+          <w:sz w:val="16"/>
+          <w:szCs w:val="16"/>
+        </w:rPr>
+        <w:t xml:space="preserve">WHERE LogDate &lt; DATEADD(DAY, -90, GETDATE());</w:t>
       </w:r>
     </w:p>
     <w:p>
@@ -19507,7 +22712,7 @@
           <w:sz w:val="17"/>
           <w:szCs w:val="17"/>
         </w:rPr>
-        <w:t xml:space="preserve">Kod:</w:t>
+        <w:t xml:space="preserve">Mevcut kod:</w:t>
       </w:r>
     </w:p>
     <w:p>
@@ -19522,6 +22727,192 @@
           <w:szCs w:val="16"/>
         </w:rPr>
         <w:t xml:space="preserve">5| CONVERT(FLOAT, ou.etiket_fiyat*((100-ISNULL(om.discount,0))/100)) AS OdakMaliyet</w:t>
+      </w:r>
+    </w:p>
+    <w:p>
+      <w:pPr>
+        <w:spacing w:after="40" w:before="100"/>
+      </w:pPr>
+      <w:r>
+        <w:rPr>
+          <w:rFonts w:ascii="Calibri" w:cs="Calibri" w:eastAsia="Calibri" w:hAnsi="Calibri"/>
+          <w:b/>
+          <w:bCs/>
+          <w:color w:val="1E7B34"/>
+          <w:sz w:val="17"/>
+          <w:szCs w:val="17"/>
+        </w:rPr>
+        <w:t xml:space="preserve">Önerilen düzeltme:</w:t>
+      </w:r>
+    </w:p>
+    <w:p>
+      <w:pPr>
+        <w:spacing w:after="40"/>
+      </w:pPr>
+      <w:r>
+        <w:rPr>
+          <w:rFonts w:ascii="Calibri" w:cs="Calibri" w:eastAsia="Calibri" w:hAnsi="Calibri"/>
+          <w:i/>
+          <w:iCs/>
+          <w:color w:val="555555"/>
+          <w:sz w:val="17"/>
+          <w:szCs w:val="17"/>
+        </w:rPr>
+        <w:t xml:space="preserve">Etki(ölçüldü): 647.529 → 647.486 satır; stkID başına çok satır 40 → 0.</w:t>
+      </w:r>
+    </w:p>
+    <w:p>
+      <w:pPr>
+        <w:shd w:fill="F4F4F4" w:color="auto" w:val="clear"/>
+        <w:spacing w:after="0"/>
+      </w:pPr>
+      <w:r>
+        <w:rPr>
+          <w:rFonts w:ascii="Consolas" w:cs="Consolas" w:eastAsia="Consolas" w:hAnsi="Consolas"/>
+          <w:sz w:val="16"/>
+          <w:szCs w:val="16"/>
+        </w:rPr>
+        <w:t xml:space="preserve">SELECT ub.urnBrkdStkID AS StkID,</w:t>
+      </w:r>
+    </w:p>
+    <w:p>
+      <w:pPr>
+        <w:shd w:fill="F4F4F4" w:color="auto" w:val="clear"/>
+        <w:spacing w:after="0"/>
+      </w:pPr>
+      <w:r>
+        <w:rPr>
+          <w:rFonts w:ascii="Consolas" w:cs="Consolas" w:eastAsia="Consolas" w:hAnsi="Consolas"/>
+          <w:sz w:val="16"/>
+          <w:szCs w:val="16"/>
+        </w:rPr>
+        <w:t xml:space="preserve">       MAX(ou.barkod) AS barkod,</w:t>
+      </w:r>
+    </w:p>
+    <w:p>
+      <w:pPr>
+        <w:shd w:fill="F4F4F4" w:color="auto" w:val="clear"/>
+        <w:spacing w:after="0"/>
+      </w:pPr>
+      <w:r>
+        <w:rPr>
+          <w:rFonts w:ascii="Consolas" w:cs="Consolas" w:eastAsia="Consolas" w:hAnsi="Consolas"/>
+          <w:sz w:val="16"/>
+          <w:szCs w:val="16"/>
+        </w:rPr>
+        <w:t xml:space="preserve">       MAX(om.discount) AS OdakIskonto,</w:t>
+      </w:r>
+    </w:p>
+    <w:p>
+      <w:pPr>
+        <w:shd w:fill="F4F4F4" w:color="auto" w:val="clear"/>
+        <w:spacing w:after="0"/>
+      </w:pPr>
+      <w:r>
+        <w:rPr>
+          <w:rFonts w:ascii="Consolas" w:cs="Consolas" w:eastAsia="Consolas" w:hAnsi="Consolas"/>
+          <w:sz w:val="16"/>
+          <w:szCs w:val="16"/>
+        </w:rPr>
+        <w:t xml:space="preserve">       MAX(ou.etiket_fiyat) AS UstFiyat,</w:t>
+      </w:r>
+    </w:p>
+    <w:p>
+      <w:pPr>
+        <w:shd w:fill="F4F4F4" w:color="auto" w:val="clear"/>
+        <w:spacing w:after="0"/>
+      </w:pPr>
+      <w:r>
+        <w:rPr>
+          <w:rFonts w:ascii="Consolas" w:cs="Consolas" w:eastAsia="Consolas" w:hAnsi="Consolas"/>
+          <w:sz w:val="16"/>
+          <w:szCs w:val="16"/>
+        </w:rPr>
+        <w:t xml:space="preserve">       CAST(MAX(ou.etiket_fiyat * (100 - ISNULL(om.discount,0)) / 100) AS decimal(18,4)) AS OdakMaliyet,   -- DÜZELTME: FLOAT → DECIMAL</w:t>
+      </w:r>
+    </w:p>
+    <w:p>
+      <w:pPr>
+        <w:shd w:fill="F4F4F4" w:color="auto" w:val="clear"/>
+        <w:spacing w:after="0"/>
+      </w:pPr>
+      <w:r>
+        <w:rPr>
+          <w:rFonts w:ascii="Consolas" w:cs="Consolas" w:eastAsia="Consolas" w:hAnsi="Consolas"/>
+          <w:sz w:val="16"/>
+          <w:szCs w:val="16"/>
+        </w:rPr>
+        <w:t xml:space="preserve">       MAX(o.Durum) AS OdakDurum</w:t>
+      </w:r>
+    </w:p>
+    <w:p>
+      <w:pPr>
+        <w:shd w:fill="F4F4F4" w:color="auto" w:val="clear"/>
+        <w:spacing w:after="0"/>
+      </w:pPr>
+      <w:r>
+        <w:rPr>
+          <w:rFonts w:ascii="Consolas" w:cs="Consolas" w:eastAsia="Consolas" w:hAnsi="Consolas"/>
+          <w:sz w:val="16"/>
+          <w:szCs w:val="16"/>
+        </w:rPr>
+        <w:t xml:space="preserve">FROM BKMDATA.ent.odak_urun_tam AS ou</w:t>
+      </w:r>
+    </w:p>
+    <w:p>
+      <w:pPr>
+        <w:shd w:fill="F4F4F4" w:color="auto" w:val="clear"/>
+        <w:spacing w:after="0"/>
+      </w:pPr>
+      <w:r>
+        <w:rPr>
+          <w:rFonts w:ascii="Consolas" w:cs="Consolas" w:eastAsia="Consolas" w:hAnsi="Consolas"/>
+          <w:sz w:val="16"/>
+          <w:szCs w:val="16"/>
+        </w:rPr>
+        <w:t xml:space="preserve">JOIN BKMDATA.ent.odak_marka AS om ON om.group_id = ou.group_id AND om.parent_id = ou.marka_id</w:t>
+      </w:r>
+    </w:p>
+    <w:p>
+      <w:pPr>
+        <w:shd w:fill="F4F4F4" w:color="auto" w:val="clear"/>
+        <w:spacing w:after="0"/>
+      </w:pPr>
+      <w:r>
+        <w:rPr>
+          <w:rFonts w:ascii="Consolas" w:cs="Consolas" w:eastAsia="Consolas" w:hAnsi="Consolas"/>
+          <w:sz w:val="16"/>
+          <w:szCs w:val="16"/>
+        </w:rPr>
+        <w:t xml:space="preserve">JOIN DerinSISBkm.dbo.urnBrkd AS ub ON ub.urnBarkod = ou.barkod</w:t>
+      </w:r>
+    </w:p>
+    <w:p>
+      <w:pPr>
+        <w:shd w:fill="F4F4F4" w:color="auto" w:val="clear"/>
+        <w:spacing w:after="0"/>
+      </w:pPr>
+      <w:r>
+        <w:rPr>
+          <w:rFonts w:ascii="Consolas" w:cs="Consolas" w:eastAsia="Consolas" w:hAnsi="Consolas"/>
+          <w:sz w:val="16"/>
+          <w:szCs w:val="16"/>
+        </w:rPr>
+        <w:t xml:space="preserve">JOIN BKMDATA.ent.odak_urun AS o    ON o.urun_id = ou.urun_id</w:t>
+      </w:r>
+    </w:p>
+    <w:p>
+      <w:pPr>
+        <w:shd w:fill="F4F4F4" w:color="auto" w:val="clear"/>
+        <w:spacing w:after="0"/>
+      </w:pPr>
+      <w:r>
+        <w:rPr>
+          <w:rFonts w:ascii="Consolas" w:cs="Consolas" w:eastAsia="Consolas" w:hAnsi="Consolas"/>
+          <w:sz w:val="16"/>
+          <w:szCs w:val="16"/>
+        </w:rPr>
+        <w:t xml:space="preserve">GROUP BY ub.urnBrkdStkID;                                               -- DÜZELTME: stkID başına tek satır</w:t>
       </w:r>
     </w:p>
     <w:p>

</xml_diff>